<commit_message>
Updated App Script Connection
</commit_message>
<xml_diff>
--- a/docs/asset-management/Recording Scripts/Professor_Pixel_Recording_Script.docx
+++ b/docs/asset-management/Recording Scripts/Professor_Pixel_Recording_Script.docx
@@ -46,7 +46,6 @@
         </w:tc>
       </w:tr>
     </w:tbl>
-    <w:p/>
     <w:p>
       <w:r>
         <w:rPr>
@@ -481,6 +480,43 @@
         <w:spacing w:after="20"/>
       </w:pPr>
     </w:p>
+    <w:p>
+      <w:pPr>
+        <w:spacing w:before="160" w:after="100"/>
+      </w:pPr>
+      <w:r>
+        <w:rPr>
+          <w:rFonts w:ascii="Aptos Display" w:hAnsi="Aptos Display"/>
+          <w:b/>
+          <w:color w:val="0B2348"/>
+          <w:sz w:val="30"/>
+        </w:rPr>
+        <w:t>S1: Content Avalanche</w:t>
+      </w:r>
+      <w:r>
+        <w:rPr>
+          <w:rFonts w:ascii="Aptos" w:hAnsi="Aptos"/>
+          <w:i/>
+          <w:color w:val="61748A"/>
+          <w:sz w:val="18"/>
+        </w:rPr>
+        <w:t xml:space="preserve">  New S1 lines — review wording before recording.</w:t>
+      </w:r>
+    </w:p>
+    <w:p>
+      <w:pPr>
+        <w:spacing w:before="160" w:after="100"/>
+      </w:pPr>
+      <w:r>
+        <w:rPr>
+          <w:rFonts w:ascii="Aptos Display" w:hAnsi="Aptos Display"/>
+          <w:b/>
+          <w:color w:val="0B2348"/>
+          <w:sz w:val="30"/>
+        </w:rPr>
+        <w:t>Opening narration</w:t>
+      </w:r>
+    </w:p>
     <w:tbl>
       <w:tblPr>
         <w:tblW w:type="auto" w:w="0"/>
@@ -519,7 +555,7 @@
                 <w:color w:val="0B2348"/>
                 <w:sz w:val="20"/>
               </w:rPr>
-              <w:t>04 · p4</w:t>
+              <w:t>04 · p-s1-ca-01</w:t>
             </w:r>
           </w:p>
           <w:p>
@@ -533,7 +569,7 @@
                 <w:color w:val="1178B5"/>
                 <w:sz w:val="18"/>
               </w:rPr>
-              <w:t>p4.mp3</w:t>
+              <w:t>p-s1-ca-01.mp3</w:t>
             </w:r>
           </w:p>
           <w:p>
@@ -546,7 +582,21 @@
                 <w:color w:val="61748A"/>
                 <w:sz w:val="17"/>
               </w:rPr>
-              <w:t>Thinking · vague</w:t>
+              <w:t>Neutral · scenarioStart_content-avalanche</w:t>
+            </w:r>
+          </w:p>
+          <w:p>
+            <w:pPr>
+              <w:spacing w:after="0"/>
+            </w:pPr>
+            <w:r>
+              <w:rPr>
+                <w:rFonts w:ascii="Aptos" w:hAnsi="Aptos"/>
+                <w:b/>
+                <w:color w:val="9A5B00"/>
+                <w:sz w:val="16"/>
+              </w:rPr>
+              <w:t>REVIEW WORDING</w:t>
             </w:r>
           </w:p>
         </w:tc>
@@ -572,7 +622,7 @@
                 <w:color w:val="14233B"/>
                 <w:sz w:val="23"/>
               </w:rPr>
-              <w:t>Hmm. The AI did its best, but that prompt could have been written by anyone, for anyone.</w:t>
+              <w:t>Before we open Canvas, here is the situation. An instructor has taught this topic for years and built Week 4 gradually as the course evolved.</w:t>
             </w:r>
           </w:p>
         </w:tc>
@@ -621,7 +671,7 @@
                 <w:color w:val="0B2348"/>
                 <w:sz w:val="20"/>
               </w:rPr>
-              <w:t>05 · p5</w:t>
+              <w:t>05 · p-s1-ca-02</w:t>
             </w:r>
           </w:p>
           <w:p>
@@ -635,7 +685,7 @@
                 <w:color w:val="1178B5"/>
                 <w:sz w:val="18"/>
               </w:rPr>
-              <w:t>p5.mp3</w:t>
+              <w:t>p-s1-ca-02.mp3</w:t>
             </w:r>
           </w:p>
           <w:p>
@@ -648,7 +698,21 @@
                 <w:color w:val="61748A"/>
                 <w:sz w:val="17"/>
               </w:rPr>
-              <w:t>Skeptical · vague</w:t>
+              <w:t>Thinking · scenarioStart_content-avalanche</w:t>
+            </w:r>
+          </w:p>
+          <w:p>
+            <w:pPr>
+              <w:spacing w:after="0"/>
+            </w:pPr>
+            <w:r>
+              <w:rPr>
+                <w:rFonts w:ascii="Aptos" w:hAnsi="Aptos"/>
+                <w:b/>
+                <w:color w:val="9A5B00"/>
+                <w:sz w:val="16"/>
+              </w:rPr>
+              <w:t>REVIEW WORDING</w:t>
             </w:r>
           </w:p>
         </w:tc>
@@ -674,7 +738,7 @@
                 <w:color w:val="14233B"/>
                 <w:sz w:val="23"/>
               </w:rPr>
-              <w:t>Try telling it who your students actually are and what you specifically need from them.</w:t>
+              <w:t>Every addition had a reason: notes, a transcript, readings, models, examples, a quiz, and a written comparison. This course does not lack content, expertise, or instructor effort.</w:t>
             </w:r>
           </w:p>
         </w:tc>
@@ -723,7 +787,7 @@
                 <w:color w:val="0B2348"/>
                 <w:sz w:val="20"/>
               </w:rPr>
-              <w:t>06 · p6</w:t>
+              <w:t>06 · p-s1-ca-03</w:t>
             </w:r>
           </w:p>
           <w:p>
@@ -737,7 +801,7 @@
                 <w:color w:val="1178B5"/>
                 <w:sz w:val="18"/>
               </w:rPr>
-              <w:t>p6.mp3</w:t>
+              <w:t>p-s1-ca-03.mp3</w:t>
             </w:r>
           </w:p>
           <w:p>
@@ -750,7 +814,21 @@
                 <w:color w:val="61748A"/>
                 <w:sz w:val="17"/>
               </w:rPr>
-              <w:t>Encouraging · decent</w:t>
+              <w:t>Thinking · scenarioStart_content-avalanche</w:t>
+            </w:r>
+          </w:p>
+          <w:p>
+            <w:pPr>
+              <w:spacing w:after="0"/>
+            </w:pPr>
+            <w:r>
+              <w:rPr>
+                <w:rFonts w:ascii="Aptos" w:hAnsi="Aptos"/>
+                <w:b/>
+                <w:color w:val="9A5B00"/>
+                <w:sz w:val="16"/>
+              </w:rPr>
+              <w:t>REVIEW WORDING</w:t>
             </w:r>
           </w:p>
         </w:tc>
@@ -776,7 +854,137 @@
                 <w:color w:val="14233B"/>
                 <w:sz w:val="23"/>
               </w:rPr>
-              <w:t>Getting warmer! You gave the AI something real to work with.</w:t>
+              <w:t>But students kept asking where to begin, which version to use, and what the comparison required. We are not judging the instructor—we are tracing where expert knowledge never became visible course design.</w:t>
+            </w:r>
+          </w:p>
+        </w:tc>
+      </w:tr>
+    </w:tbl>
+    <w:p>
+      <w:pPr>
+        <w:spacing w:after="20"/>
+      </w:pPr>
+    </w:p>
+    <w:p>
+      <w:pPr>
+        <w:spacing w:before="160" w:after="100"/>
+      </w:pPr>
+      <w:r>
+        <w:rPr>
+          <w:rFonts w:ascii="Aptos Display" w:hAnsi="Aptos Display"/>
+          <w:b/>
+          <w:color w:val="0B2348"/>
+          <w:sz w:val="30"/>
+        </w:rPr>
+        <w:t>Evidence station intro</w:t>
+      </w:r>
+    </w:p>
+    <w:tbl>
+      <w:tblPr>
+        <w:tblW w:type="auto" w:w="0"/>
+        <w:jc w:val="center"/>
+        <w:tblLayout w:type="fixed"/>
+        <w:tblLook w:firstColumn="1" w:firstRow="1" w:lastColumn="0" w:lastRow="0" w:noHBand="0" w:noVBand="1" w:val="04A0"/>
+      </w:tblPr>
+      <w:tblGrid>
+        <w:gridCol w:w="3096"/>
+        <w:gridCol w:w="6984"/>
+      </w:tblGrid>
+      <w:tr>
+        <w:trPr>
+          <w:cantSplit/>
+        </w:trPr>
+        <w:tc>
+          <w:tcPr>
+            <w:tcW w:type="dxa" w:w="5112"/>
+            <w:shd w:fill="FBF7ED"/>
+            <w:vAlign w:val="top"/>
+            <w:tcBorders>
+              <w:top w:val="single" w:sz="6" w:color="C8D5E3"/>
+              <w:start w:val="single" w:sz="6" w:color="C8D5E3"/>
+              <w:bottom w:val="single" w:sz="6" w:color="C8D5E3"/>
+              <w:end w:val="single" w:sz="6" w:color="C8D5E3"/>
+            </w:tcBorders>
+          </w:tcPr>
+          <w:p>
+            <w:pPr>
+              <w:spacing w:after="40"/>
+            </w:pPr>
+            <w:r>
+              <w:rPr>
+                <w:rFonts w:ascii="Aptos" w:hAnsi="Aptos"/>
+                <w:b/>
+                <w:color w:val="0B2348"/>
+                <w:sz w:val="20"/>
+              </w:rPr>
+              <w:t>07 · p-s1-ca-04</w:t>
+            </w:r>
+          </w:p>
+          <w:p>
+            <w:pPr>
+              <w:spacing w:after="20"/>
+            </w:pPr>
+            <w:r>
+              <w:rPr>
+                <w:rFonts w:ascii="Aptos" w:hAnsi="Aptos"/>
+                <w:b/>
+                <w:color w:val="1178B5"/>
+                <w:sz w:val="18"/>
+              </w:rPr>
+              <w:t>p-s1-ca-04.mp3</w:t>
+            </w:r>
+          </w:p>
+          <w:p>
+            <w:pPr>
+              <w:spacing w:after="20"/>
+            </w:pPr>
+            <w:r>
+              <w:rPr>
+                <w:rFonts w:ascii="Aptos" w:hAnsi="Aptos"/>
+                <w:color w:val="61748A"/>
+                <w:sz w:val="17"/>
+              </w:rPr>
+              <w:t>Neutral · s1_canvas_evidence_intro</w:t>
+            </w:r>
+          </w:p>
+          <w:p>
+            <w:pPr>
+              <w:spacing w:after="0"/>
+            </w:pPr>
+            <w:r>
+              <w:rPr>
+                <w:rFonts w:ascii="Aptos" w:hAnsi="Aptos"/>
+                <w:b/>
+                <w:color w:val="9A5B00"/>
+                <w:sz w:val="16"/>
+              </w:rPr>
+              <w:t>REVIEW WORDING</w:t>
+            </w:r>
+          </w:p>
+        </w:tc>
+        <w:tc>
+          <w:tcPr>
+            <w:tcW w:type="dxa" w:w="5112"/>
+            <w:shd w:fill="FFFFFF"/>
+            <w:vAlign w:val="top"/>
+            <w:tcBorders>
+              <w:top w:val="single" w:sz="6" w:color="C8D5E3"/>
+              <w:start w:val="single" w:sz="6" w:color="C8D5E3"/>
+              <w:bottom w:val="single" w:sz="6" w:color="C8D5E3"/>
+              <w:end w:val="single" w:sz="6" w:color="C8D5E3"/>
+            </w:tcBorders>
+          </w:tcPr>
+          <w:p>
+            <w:pPr>
+              <w:spacing w:after="0"/>
+            </w:pPr>
+            <w:r>
+              <w:rPr>
+                <w:rFonts w:ascii="Aptos" w:hAnsi="Aptos"/>
+                <w:color w:val="14233B"/>
+                <w:sz w:val="23"/>
+              </w:rPr>
+              <w:t>Now let us open the actual Week 4 module. Eli will help us examine the difference between having access to the content and having a visible path through it.</w:t>
             </w:r>
           </w:p>
         </w:tc>
@@ -825,7 +1033,7 @@
                 <w:color w:val="0B2348"/>
                 <w:sz w:val="20"/>
               </w:rPr>
-              <w:t>07 · p7</w:t>
+              <w:t>08 · p-s1-ca-06</w:t>
             </w:r>
           </w:p>
           <w:p>
@@ -839,7 +1047,7 @@
                 <w:color w:val="1178B5"/>
                 <w:sz w:val="18"/>
               </w:rPr>
-              <w:t>p7.mp3</w:t>
+              <w:t>p-s1-ca-06.mp3</w:t>
             </w:r>
           </w:p>
           <w:p>
@@ -852,7 +1060,21 @@
                 <w:color w:val="61748A"/>
                 <w:sz w:val="17"/>
               </w:rPr>
-              <w:t>Neutral · decent</w:t>
+              <w:t>Encouraging · s1_canvas_evidence_intro</w:t>
+            </w:r>
+          </w:p>
+          <w:p>
+            <w:pPr>
+              <w:spacing w:after="0"/>
+            </w:pPr>
+            <w:r>
+              <w:rPr>
+                <w:rFonts w:ascii="Aptos" w:hAnsi="Aptos"/>
+                <w:b/>
+                <w:color w:val="9A5B00"/>
+                <w:sz w:val="16"/>
+              </w:rPr>
+              <w:t>REVIEW WORDING</w:t>
             </w:r>
           </w:p>
         </w:tc>
@@ -878,7 +1100,7 @@
                 <w:color w:val="14233B"/>
                 <w:sz w:val="23"/>
               </w:rPr>
-              <w:t>Now push a little further — what constraints or context would make this even more useful in your actual classroom?</w:t>
+              <w:t>Each case begins with a Before screen. Eli will describe the learner experience, and I will focus your inspection before you reveal the redesign.</w:t>
             </w:r>
           </w:p>
         </w:tc>
@@ -927,7 +1149,7 @@
                 <w:color w:val="0B2348"/>
                 <w:sz w:val="20"/>
               </w:rPr>
-              <w:t>08 · p8</w:t>
+              <w:t>09 · p-s1-ca-07</w:t>
             </w:r>
           </w:p>
           <w:p>
@@ -941,7 +1163,7 @@
                 <w:color w:val="1178B5"/>
                 <w:sz w:val="18"/>
               </w:rPr>
-              <w:t>p8.mp3</w:t>
+              <w:t>p-s1-ca-07.mp3</w:t>
             </w:r>
           </w:p>
           <w:p>
@@ -954,7 +1176,21 @@
                 <w:color w:val="61748A"/>
                 <w:sz w:val="17"/>
               </w:rPr>
-              <w:t>Excited · strong</w:t>
+              <w:t>Thinking · s1_canvas_evidence_intro</w:t>
+            </w:r>
+          </w:p>
+          <w:p>
+            <w:pPr>
+              <w:spacing w:after="0"/>
+            </w:pPr>
+            <w:r>
+              <w:rPr>
+                <w:rFonts w:ascii="Aptos" w:hAnsi="Aptos"/>
+                <w:b/>
+                <w:color w:val="9A5B00"/>
+                <w:sz w:val="16"/>
+              </w:rPr>
+              <w:t>REVIEW WORDING</w:t>
             </w:r>
           </w:p>
         </w:tc>
@@ -980,7 +1216,137 @@
                 <w:color w:val="14233B"/>
                 <w:sz w:val="23"/>
               </w:rPr>
-              <w:t>Now that is what I am talking about!</w:t>
+              <w:t>Look for what students must infer, remember, or hunt down. AI can help reorganize the content, but you decide whether the visible learning path actually works.</w:t>
+            </w:r>
+          </w:p>
+        </w:tc>
+      </w:tr>
+    </w:tbl>
+    <w:p>
+      <w:pPr>
+        <w:spacing w:after="20"/>
+      </w:pPr>
+    </w:p>
+    <w:p>
+      <w:pPr>
+        <w:spacing w:before="160" w:after="100"/>
+      </w:pPr>
+      <w:r>
+        <w:rPr>
+          <w:rFonts w:ascii="Aptos Display" w:hAnsi="Aptos Display"/>
+          <w:b/>
+          <w:color w:val="0B2348"/>
+          <w:sz w:val="30"/>
+        </w:rPr>
+        <w:t>Case 1: Module structure</w:t>
+      </w:r>
+    </w:p>
+    <w:tbl>
+      <w:tblPr>
+        <w:tblW w:type="auto" w:w="0"/>
+        <w:jc w:val="center"/>
+        <w:tblLayout w:type="fixed"/>
+        <w:tblLook w:firstColumn="1" w:firstRow="1" w:lastColumn="0" w:lastRow="0" w:noHBand="0" w:noVBand="1" w:val="04A0"/>
+      </w:tblPr>
+      <w:tblGrid>
+        <w:gridCol w:w="3096"/>
+        <w:gridCol w:w="6984"/>
+      </w:tblGrid>
+      <w:tr>
+        <w:trPr>
+          <w:cantSplit/>
+        </w:trPr>
+        <w:tc>
+          <w:tcPr>
+            <w:tcW w:type="dxa" w:w="5112"/>
+            <w:shd w:fill="FBF7ED"/>
+            <w:vAlign w:val="top"/>
+            <w:tcBorders>
+              <w:top w:val="single" w:sz="6" w:color="C8D5E3"/>
+              <w:start w:val="single" w:sz="6" w:color="C8D5E3"/>
+              <w:bottom w:val="single" w:sz="6" w:color="C8D5E3"/>
+              <w:end w:val="single" w:sz="6" w:color="C8D5E3"/>
+            </w:tcBorders>
+          </w:tcPr>
+          <w:p>
+            <w:pPr>
+              <w:spacing w:after="40"/>
+            </w:pPr>
+            <w:r>
+              <w:rPr>
+                <w:rFonts w:ascii="Aptos" w:hAnsi="Aptos"/>
+                <w:b/>
+                <w:color w:val="0B2348"/>
+                <w:sz w:val="20"/>
+              </w:rPr>
+              <w:t>10 · p-s1-case-01a</w:t>
+            </w:r>
+          </w:p>
+          <w:p>
+            <w:pPr>
+              <w:spacing w:after="20"/>
+            </w:pPr>
+            <w:r>
+              <w:rPr>
+                <w:rFonts w:ascii="Aptos" w:hAnsi="Aptos"/>
+                <w:b/>
+                <w:color w:val="1178B5"/>
+                <w:sz w:val="18"/>
+              </w:rPr>
+              <w:t>p-s1-case-01a.mp3</w:t>
+            </w:r>
+          </w:p>
+          <w:p>
+            <w:pPr>
+              <w:spacing w:after="20"/>
+            </w:pPr>
+            <w:r>
+              <w:rPr>
+                <w:rFonts w:ascii="Aptos" w:hAnsi="Aptos"/>
+                <w:color w:val="61748A"/>
+                <w:sz w:val="17"/>
+              </w:rPr>
+              <w:t>Thinking · s1_case_module_briefing</w:t>
+            </w:r>
+          </w:p>
+          <w:p>
+            <w:pPr>
+              <w:spacing w:after="0"/>
+            </w:pPr>
+            <w:r>
+              <w:rPr>
+                <w:rFonts w:ascii="Aptos" w:hAnsi="Aptos"/>
+                <w:b/>
+                <w:color w:val="9A5B00"/>
+                <w:sz w:val="16"/>
+              </w:rPr>
+              <w:t>REVIEW WORDING</w:t>
+            </w:r>
+          </w:p>
+        </w:tc>
+        <w:tc>
+          <w:tcPr>
+            <w:tcW w:type="dxa" w:w="5112"/>
+            <w:shd w:fill="FFFFFF"/>
+            <w:vAlign w:val="top"/>
+            <w:tcBorders>
+              <w:top w:val="single" w:sz="6" w:color="C8D5E3"/>
+              <w:start w:val="single" w:sz="6" w:color="C8D5E3"/>
+              <w:bottom w:val="single" w:sz="6" w:color="C8D5E3"/>
+              <w:end w:val="single" w:sz="6" w:color="C8D5E3"/>
+            </w:tcBorders>
+          </w:tcPr>
+          <w:p>
+            <w:pPr>
+              <w:spacing w:after="0"/>
+            </w:pPr>
+            <w:r>
+              <w:rPr>
+                <w:rFonts w:ascii="Aptos" w:hAnsi="Aptos"/>
+                <w:color w:val="14233B"/>
+                <w:sz w:val="23"/>
+              </w:rPr>
+              <w:t>Start with the module structure. Eli, where would you begin, and what tells you which materials prepare you for the assignment?</w:t>
             </w:r>
           </w:p>
         </w:tc>
@@ -1029,7 +1395,7 @@
                 <w:color w:val="0B2348"/>
                 <w:sz w:val="20"/>
               </w:rPr>
-              <w:t>09 · p9</w:t>
+              <w:t>11 · p-s1-case-01c</w:t>
             </w:r>
           </w:p>
           <w:p>
@@ -1043,7 +1409,7 @@
                 <w:color w:val="1178B5"/>
                 <w:sz w:val="18"/>
               </w:rPr>
-              <w:t>p9.mp3</w:t>
+              <w:t>p-s1-case-01c.mp3</w:t>
             </w:r>
           </w:p>
           <w:p>
@@ -1056,7 +1422,21 @@
                 <w:color w:val="61748A"/>
                 <w:sz w:val="17"/>
               </w:rPr>
-              <w:t>Proud · strong</w:t>
+              <w:t>Encouraging · s1_case_module_briefing</w:t>
+            </w:r>
+          </w:p>
+          <w:p>
+            <w:pPr>
+              <w:spacing w:after="0"/>
+            </w:pPr>
+            <w:r>
+              <w:rPr>
+                <w:rFonts w:ascii="Aptos" w:hAnsi="Aptos"/>
+                <w:b/>
+                <w:color w:val="9A5B00"/>
+                <w:sz w:val="16"/>
+              </w:rPr>
+              <w:t>REVIEW WORDING</w:t>
             </w:r>
           </w:p>
         </w:tc>
@@ -1082,7 +1462,7 @@
                 <w:color w:val="14233B"/>
                 <w:sz w:val="23"/>
               </w:rPr>
-              <w:t>Did you notice how much more specific and useful that response was? That is what happens when you treat AI like a capable colleague.</w:t>
+              <w:t>Your inspection: find every place the module makes Eli infer the starting point, priority, or next step. Then reveal the redesigned path.</w:t>
             </w:r>
           </w:p>
         </w:tc>
@@ -1131,7 +1511,7 @@
                 <w:color w:val="0B2348"/>
                 <w:sz w:val="20"/>
               </w:rPr>
-              <w:t>10 · p10</w:t>
+              <w:t>12 · p-s1-case-01e</w:t>
             </w:r>
           </w:p>
           <w:p>
@@ -1145,7 +1525,7 @@
                 <w:color w:val="1178B5"/>
                 <w:sz w:val="18"/>
               </w:rPr>
-              <w:t>p10.mp3</w:t>
+              <w:t>p-s1-case-01e.mp3</w:t>
             </w:r>
           </w:p>
           <w:p>
@@ -1158,7 +1538,21 @@
                 <w:color w:val="61748A"/>
                 <w:sz w:val="17"/>
               </w:rPr>
-              <w:t>Encouraging · scenarioComplete</w:t>
+              <w:t>Encouraging · s1_case_module_explanation</w:t>
+            </w:r>
+          </w:p>
+          <w:p>
+            <w:pPr>
+              <w:spacing w:after="0"/>
+            </w:pPr>
+            <w:r>
+              <w:rPr>
+                <w:rFonts w:ascii="Aptos" w:hAnsi="Aptos"/>
+                <w:b/>
+                <w:color w:val="9A5B00"/>
+                <w:sz w:val="16"/>
+              </w:rPr>
+              <w:t>REVIEW WORDING</w:t>
             </w:r>
           </w:p>
         </w:tc>
@@ -1184,7 +1578,7 @@
                 <w:color w:val="14233B"/>
                 <w:sz w:val="23"/>
               </w:rPr>
-              <w:t>Nice work finishing that one. Each scenario builds on the last.</w:t>
+              <w:t>Exactly. The priority is to make the learning path visible. Before we reveal the After view, let us hand that diagnosed problem to Babbage, review its first-pass sequence, and decide what the instructor should keep.</w:t>
             </w:r>
           </w:p>
         </w:tc>
@@ -1233,7 +1627,7 @@
                 <w:color w:val="0B2348"/>
                 <w:sz w:val="20"/>
               </w:rPr>
-              <w:t>11 · p11</w:t>
+              <w:t>13 · p-s1-case-01ai-a</w:t>
             </w:r>
           </w:p>
           <w:p>
@@ -1247,7 +1641,7 @@
                 <w:color w:val="1178B5"/>
                 <w:sz w:val="18"/>
               </w:rPr>
-              <w:t>p11.mp3</w:t>
+              <w:t>p-s1-case-01ai-a.mp3</w:t>
             </w:r>
           </w:p>
           <w:p>
@@ -1260,7 +1654,21 @@
                 <w:color w:val="61748A"/>
                 <w:sz w:val="17"/>
               </w:rPr>
-              <w:t>Neutral · scenarioComplete</w:t>
+              <w:t>Thinking · s1_case_module_ai_demo</w:t>
+            </w:r>
+          </w:p>
+          <w:p>
+            <w:pPr>
+              <w:spacing w:after="0"/>
+            </w:pPr>
+            <w:r>
+              <w:rPr>
+                <w:rFonts w:ascii="Aptos" w:hAnsi="Aptos"/>
+                <w:b/>
+                <w:color w:val="9A5B00"/>
+                <w:sz w:val="16"/>
+              </w:rPr>
+              <w:t>REVIEW WORDING</w:t>
             </w:r>
           </w:p>
         </w:tc>
@@ -1286,7 +1694,7 @@
                 <w:color w:val="14233B"/>
                 <w:sz w:val="23"/>
               </w:rPr>
-              <w:t>Your prompting instincts are already getting sharper.</w:t>
+              <w:t>Here is a useful AI task: inventory the existing items, group them by learner action, and propose a first-pass sequence without deleting anything.</w:t>
             </w:r>
           </w:p>
         </w:tc>
@@ -1335,7 +1743,7 @@
                 <w:color w:val="0B2348"/>
                 <w:sz w:val="20"/>
               </w:rPr>
-              <w:t>12 · p12</w:t>
+              <w:t>14 · p-s1-case-01ai-c</w:t>
             </w:r>
           </w:p>
           <w:p>
@@ -1349,7 +1757,7 @@
                 <w:color w:val="1178B5"/>
                 <w:sz w:val="18"/>
               </w:rPr>
-              <w:t>p12.mp3</w:t>
+              <w:t>p-s1-case-01ai-c.mp3</w:t>
             </w:r>
           </w:p>
           <w:p>
@@ -1362,7 +1770,21 @@
                 <w:color w:val="61748A"/>
                 <w:sz w:val="17"/>
               </w:rPr>
-              <w:t>Excited · allComplete</w:t>
+              <w:t>Encouraging · s1_case_module_ai_demo</w:t>
+            </w:r>
+          </w:p>
+          <w:p>
+            <w:pPr>
+              <w:spacing w:after="0"/>
+            </w:pPr>
+            <w:r>
+              <w:rPr>
+                <w:rFonts w:ascii="Aptos" w:hAnsi="Aptos"/>
+                <w:b/>
+                <w:color w:val="9A5B00"/>
+                <w:sz w:val="16"/>
+              </w:rPr>
+              <w:t>REVIEW WORDING</w:t>
             </w:r>
           </w:p>
         </w:tc>
@@ -1388,7 +1810,7 @@
                 <w:color w:val="14233B"/>
                 <w:sz w:val="23"/>
               </w:rPr>
-              <w:t>You made it through all eight scenarios!</w:t>
+              <w:t>Exactly. AI supplies the inventory and draft organization. The instructor verifies the purpose, prerequisites, and teachable order.</w:t>
             </w:r>
           </w:p>
         </w:tc>
@@ -1437,7 +1859,7 @@
                 <w:color w:val="0B2348"/>
                 <w:sz w:val="20"/>
               </w:rPr>
-              <w:t>13 · p13</w:t>
+              <w:t>15 · p-s1-case-01g</w:t>
             </w:r>
           </w:p>
           <w:p>
@@ -1451,7 +1873,7 @@
                 <w:color w:val="1178B5"/>
                 <w:sz w:val="18"/>
               </w:rPr>
-              <w:t>p13.mp3</w:t>
+              <w:t>p-s1-case-01g.mp3</w:t>
             </w:r>
           </w:p>
           <w:p>
@@ -1464,7 +1886,21 @@
                 <w:color w:val="61748A"/>
                 <w:sz w:val="17"/>
               </w:rPr>
-              <w:t>Proud · allComplete</w:t>
+              <w:t>Encouraging · s1_case_module_reveal</w:t>
+            </w:r>
+          </w:p>
+          <w:p>
+            <w:pPr>
+              <w:spacing w:after="0"/>
+            </w:pPr>
+            <w:r>
+              <w:rPr>
+                <w:rFonts w:ascii="Aptos" w:hAnsi="Aptos"/>
+                <w:b/>
+                <w:color w:val="9A5B00"/>
+                <w:sz w:val="16"/>
+              </w:rPr>
+              <w:t>REVIEW WORDING</w:t>
             </w:r>
           </w:p>
         </w:tc>
@@ -1490,7 +1926,7 @@
                 <w:color w:val="14233B"/>
                 <w:sz w:val="23"/>
               </w:rPr>
-              <w:t>Head into the Reflection Room when you are ready — I would love to know what surprised you.</w:t>
+              <w:t>Notice that the course did not need to lose its substance. The redesign made the instructor’s intended sequence visible to the learner.</w:t>
             </w:r>
           </w:p>
         </w:tc>
@@ -1512,7 +1948,7 @@
           <w:color w:val="0B2348"/>
           <w:sz w:val="30"/>
         </w:rPr>
-        <w:t>Scenario 1 opening</w:t>
+        <w:t>Case 2: Student path</w:t>
       </w:r>
     </w:p>
     <w:tbl>
@@ -1553,7 +1989,7 @@
                 <w:color w:val="0B2348"/>
                 <w:sz w:val="20"/>
               </w:rPr>
-              <w:t>14 · p14</w:t>
+              <w:t>16 · p-s1-case-02a</w:t>
             </w:r>
           </w:p>
           <w:p>
@@ -1567,7 +2003,7 @@
                 <w:color w:val="1178B5"/>
                 <w:sz w:val="18"/>
               </w:rPr>
-              <w:t>p14.mp3</w:t>
+              <w:t>p-s1-case-02a.mp3</w:t>
             </w:r>
           </w:p>
           <w:p>
@@ -1580,7 +2016,21 @@
                 <w:color w:val="61748A"/>
                 <w:sz w:val="17"/>
               </w:rPr>
-              <w:t>Neutral · scenarioStart_engagement</w:t>
+              <w:t>Thinking · s1_case_student_path_briefing</w:t>
+            </w:r>
+          </w:p>
+          <w:p>
+            <w:pPr>
+              <w:spacing w:after="0"/>
+            </w:pPr>
+            <w:r>
+              <w:rPr>
+                <w:rFonts w:ascii="Aptos" w:hAnsi="Aptos"/>
+                <w:b/>
+                <w:color w:val="9A5B00"/>
+                <w:sz w:val="16"/>
+              </w:rPr>
+              <w:t>REVIEW WORDING</w:t>
             </w:r>
           </w:p>
         </w:tc>
@@ -1606,7 +2056,7 @@
                 <w:color w:val="14233B"/>
                 <w:sz w:val="23"/>
               </w:rPr>
-              <w:t>A faculty member brought me this discussion prompt. Nothing is technically wrong with it.</w:t>
+              <w:t>Case file 2 of 4: the student view. A course can look organized to its instructor while giving students a very different experience.</w:t>
             </w:r>
           </w:p>
         </w:tc>
@@ -1655,7 +2105,7 @@
                 <w:color w:val="0B2348"/>
                 <w:sz w:val="20"/>
               </w:rPr>
-              <w:t>15 · p15</w:t>
+              <w:t>17 · p-s1-case-02c</w:t>
             </w:r>
           </w:p>
           <w:p>
@@ -1669,7 +2119,7 @@
                 <w:color w:val="1178B5"/>
                 <w:sz w:val="18"/>
               </w:rPr>
-              <w:t>p15.mp3</w:t>
+              <w:t>p-s1-case-02c.mp3</w:t>
             </w:r>
           </w:p>
           <w:p>
@@ -1682,7 +2132,21 @@
                 <w:color w:val="61748A"/>
                 <w:sz w:val="17"/>
               </w:rPr>
-              <w:t>Thinking · scenarioStart_engagement</w:t>
+              <w:t>Encouraging · s1_case_student_path_briefing</w:t>
+            </w:r>
+          </w:p>
+          <w:p>
+            <w:pPr>
+              <w:spacing w:after="0"/>
+            </w:pPr>
+            <w:r>
+              <w:rPr>
+                <w:rFonts w:ascii="Aptos" w:hAnsi="Aptos"/>
+                <w:b/>
+                <w:color w:val="9A5B00"/>
+                <w:sz w:val="16"/>
+              </w:rPr>
+              <w:t>REVIEW WORDING</w:t>
             </w:r>
           </w:p>
         </w:tc>
@@ -1708,7 +2172,7 @@
                 <w:color w:val="14233B"/>
                 <w:sz w:val="23"/>
               </w:rPr>
-              <w:t>Students are posting. Students are replying. The assignment is being completed.</w:t>
+              <w:t>Your inspection: identify what Eli must open, remember, or guess before he can follow the intended learning path.</w:t>
             </w:r>
           </w:p>
         </w:tc>
@@ -1757,7 +2221,7 @@
                 <w:color w:val="0B2348"/>
                 <w:sz w:val="20"/>
               </w:rPr>
-              <w:t>16 · p16</w:t>
+              <w:t>18 · p-s1-case-02e</w:t>
             </w:r>
           </w:p>
           <w:p>
@@ -1771,7 +2235,7 @@
                 <w:color w:val="1178B5"/>
                 <w:sz w:val="18"/>
               </w:rPr>
-              <w:t>p16.mp3</w:t>
+              <w:t>p-s1-case-02e.mp3</w:t>
             </w:r>
           </w:p>
           <w:p>
@@ -1784,7 +2248,21 @@
                 <w:color w:val="61748A"/>
                 <w:sz w:val="17"/>
               </w:rPr>
-              <w:t>Encouraging · scenarioStart_engagement</w:t>
+              <w:t>Encouraging · s1_case_student_path_explanation</w:t>
+            </w:r>
+          </w:p>
+          <w:p>
+            <w:pPr>
+              <w:spacing w:after="0"/>
+            </w:pPr>
+            <w:r>
+              <w:rPr>
+                <w:rFonts w:ascii="Aptos" w:hAnsi="Aptos"/>
+                <w:b/>
+                <w:color w:val="9A5B00"/>
+                <w:sz w:val="16"/>
+              </w:rPr>
+              <w:t>REVIEW WORDING</w:t>
             </w:r>
           </w:p>
         </w:tc>
@@ -1810,123 +2288,7 @@
                 <w:color w:val="14233B"/>
                 <w:sz w:val="23"/>
               </w:rPr>
-              <w:t>But the conversation dies after a single exchange. Let's figure out why.</w:t>
-            </w:r>
-          </w:p>
-        </w:tc>
-      </w:tr>
-    </w:tbl>
-    <w:p>
-      <w:pPr>
-        <w:spacing w:after="20"/>
-      </w:pPr>
-    </w:p>
-    <w:p>
-      <w:pPr>
-        <w:spacing w:before="160" w:after="100"/>
-      </w:pPr>
-      <w:r>
-        <w:rPr>
-          <w:rFonts w:ascii="Aptos Display" w:hAnsi="Aptos Display"/>
-          <w:b/>
-          <w:color w:val="0B2348"/>
-          <w:sz w:val="30"/>
-        </w:rPr>
-        <w:t>Scenario 1 prediction &amp; analysis</w:t>
-      </w:r>
-    </w:p>
-    <w:tbl>
-      <w:tblPr>
-        <w:tblW w:type="auto" w:w="0"/>
-        <w:jc w:val="center"/>
-        <w:tblLayout w:type="fixed"/>
-        <w:tblLook w:firstColumn="1" w:firstRow="1" w:lastColumn="0" w:lastRow="0" w:noHBand="0" w:noVBand="1" w:val="04A0"/>
-      </w:tblPr>
-      <w:tblGrid>
-        <w:gridCol w:w="3096"/>
-        <w:gridCol w:w="6984"/>
-      </w:tblGrid>
-      <w:tr>
-        <w:trPr>
-          <w:cantSplit/>
-        </w:trPr>
-        <w:tc>
-          <w:tcPr>
-            <w:tcW w:type="dxa" w:w="5112"/>
-            <w:shd w:fill="FBF7ED"/>
-            <w:vAlign w:val="top"/>
-            <w:tcBorders>
-              <w:top w:val="single" w:sz="6" w:color="C8D5E3"/>
-              <w:start w:val="single" w:sz="6" w:color="C8D5E3"/>
-              <w:bottom w:val="single" w:sz="6" w:color="C8D5E3"/>
-              <w:end w:val="single" w:sz="6" w:color="C8D5E3"/>
-            </w:tcBorders>
-          </w:tcPr>
-          <w:p>
-            <w:pPr>
-              <w:spacing w:after="40"/>
-            </w:pPr>
-            <w:r>
-              <w:rPr>
-                <w:rFonts w:ascii="Aptos" w:hAnsi="Aptos"/>
-                <w:b/>
-                <w:color w:val="0B2348"/>
-                <w:sz w:val="20"/>
-              </w:rPr>
-              <w:t>17 · p47</w:t>
-            </w:r>
-          </w:p>
-          <w:p>
-            <w:pPr>
-              <w:spacing w:after="20"/>
-            </w:pPr>
-            <w:r>
-              <w:rPr>
-                <w:rFonts w:ascii="Aptos" w:hAnsi="Aptos"/>
-                <w:b/>
-                <w:color w:val="1178B5"/>
-                <w:sz w:val="18"/>
-              </w:rPr>
-              <w:t>p47.mp3</w:t>
-            </w:r>
-          </w:p>
-          <w:p>
-            <w:pPr>
-              <w:spacing w:after="20"/>
-            </w:pPr>
-            <w:r>
-              <w:rPr>
-                <w:rFonts w:ascii="Aptos" w:hAnsi="Aptos"/>
-                <w:color w:val="61748A"/>
-                <w:sz w:val="17"/>
-              </w:rPr>
-              <w:t>Natural · predictionReaction_targeted</w:t>
-            </w:r>
-          </w:p>
-        </w:tc>
-        <w:tc>
-          <w:tcPr>
-            <w:tcW w:type="dxa" w:w="5112"/>
-            <w:shd w:fill="FFFFFF"/>
-            <w:vAlign w:val="top"/>
-            <w:tcBorders>
-              <w:top w:val="single" w:sz="6" w:color="C8D5E3"/>
-              <w:start w:val="single" w:sz="6" w:color="C8D5E3"/>
-              <w:bottom w:val="single" w:sz="6" w:color="C8D5E3"/>
-              <w:end w:val="single" w:sz="6" w:color="C8D5E3"/>
-            </w:tcBorders>
-          </w:tcPr>
-          <w:p>
-            <w:pPr>
-              <w:spacing w:after="0"/>
-            </w:pPr>
-            <w:r>
-              <w:rPr>
-                <w:rFonts w:ascii="Aptos" w:hAnsi="Aptos"/>
-                <w:color w:val="14233B"/>
-                <w:sz w:val="23"/>
-              </w:rPr>
-              <w:t>That prediction makes sense. You gave Claude learner context, the actual discussion failure, and a clear interaction move, so it should have enough to give a targeted repair.</w:t>
+              <w:t>Right. Before we reveal the After view, we will ask Babbage to audit only the student-visible signals, review what it flags, and decide what the instructor should change.</w:t>
             </w:r>
           </w:p>
         </w:tc>
@@ -1975,7 +2337,7 @@
                 <w:color w:val="0B2348"/>
                 <w:sz w:val="20"/>
               </w:rPr>
-              <w:t>18 · p48</w:t>
+              <w:t>19 · p-s1-case-02ai-a</w:t>
             </w:r>
           </w:p>
           <w:p>
@@ -1989,7 +2351,7 @@
                 <w:color w:val="1178B5"/>
                 <w:sz w:val="18"/>
               </w:rPr>
-              <w:t>p48.mp3</w:t>
+              <w:t>p-s1-case-02ai-a.mp3</w:t>
             </w:r>
           </w:p>
           <w:p>
@@ -2002,7 +2364,21 @@
                 <w:color w:val="61748A"/>
                 <w:sz w:val="17"/>
               </w:rPr>
-              <w:t>Natural · predictionReaction_generic</w:t>
+              <w:t>Thinking · s1_case_student_path_ai_demo</w:t>
+            </w:r>
+          </w:p>
+          <w:p>
+            <w:pPr>
+              <w:spacing w:after="0"/>
+            </w:pPr>
+            <w:r>
+              <w:rPr>
+                <w:rFonts w:ascii="Aptos" w:hAnsi="Aptos"/>
+                <w:b/>
+                <w:color w:val="9A5B00"/>
+                <w:sz w:val="16"/>
+              </w:rPr>
+              <w:t>REVIEW WORDING</w:t>
             </w:r>
           </w:p>
         </w:tc>
@@ -2028,7 +2404,7 @@
                 <w:color w:val="14233B"/>
                 <w:sz w:val="23"/>
               </w:rPr>
-              <w:t>That could happen. Claude can still drift into polite template language if it treats the issue as make this better instead of fix this exact discussion breakdown.</w:t>
+              <w:t>For this case, Babbage audits only what is visible in the student view: destination, starting point, action labels, and a clear completion point.</w:t>
             </w:r>
           </w:p>
         </w:tc>
@@ -2077,7 +2453,7 @@
                 <w:color w:val="0B2348"/>
                 <w:sz w:val="20"/>
               </w:rPr>
-              <w:t>19 · p49</w:t>
+              <w:t>20 · p-s1-case-02ai-c</w:t>
             </w:r>
           </w:p>
           <w:p>
@@ -2091,7 +2467,7 @@
                 <w:color w:val="1178B5"/>
                 <w:sz w:val="18"/>
               </w:rPr>
-              <w:t>p49.mp3</w:t>
+              <w:t>p-s1-case-02ai-c.mp3</w:t>
             </w:r>
           </w:p>
           <w:p>
@@ -2104,7 +2480,21 @@
                 <w:color w:val="61748A"/>
                 <w:sz w:val="17"/>
               </w:rPr>
-              <w:t>Natural · predictionReaction_ignores_constraints</w:t>
+              <w:t>Encouraging · s1_case_student_path_ai_demo</w:t>
+            </w:r>
+          </w:p>
+          <w:p>
+            <w:pPr>
+              <w:spacing w:after="0"/>
+            </w:pPr>
+            <w:r>
+              <w:rPr>
+                <w:rFonts w:ascii="Aptos" w:hAnsi="Aptos"/>
+                <w:b/>
+                <w:color w:val="9A5B00"/>
+                <w:sz w:val="16"/>
+              </w:rPr>
+              <w:t>REVIEW WORDING</w:t>
             </w:r>
           </w:p>
         </w:tc>
@@ -2130,7 +2520,7 @@
                 <w:color w:val="14233B"/>
                 <w:sz w:val="23"/>
               </w:rPr>
-              <w:t>Good caution. Constraints are where AI often gets mushy. Naming them before the output helps you check whether Claude actually respected them.</w:t>
+              <w:t>Use AI as a rapid inspection partner, then validate its findings with student-view testing and real learner feedback.</w:t>
             </w:r>
           </w:p>
         </w:tc>
@@ -2179,7 +2569,7 @@
                 <w:color w:val="0B2348"/>
                 <w:sz w:val="20"/>
               </w:rPr>
-              <w:t>20 · p50</w:t>
+              <w:t>21 · p-s1-case-02g</w:t>
             </w:r>
           </w:p>
           <w:p>
@@ -2193,7 +2583,7 @@
                 <w:color w:val="1178B5"/>
                 <w:sz w:val="18"/>
               </w:rPr>
-              <w:t>p50.mp3</w:t>
+              <w:t>p-s1-case-02g.mp3</w:t>
             </w:r>
           </w:p>
           <w:p>
@@ -2206,7 +2596,21 @@
                 <w:color w:val="61748A"/>
                 <w:sz w:val="17"/>
               </w:rPr>
-              <w:t>Natural · predictionReaction_not_sure</w:t>
+              <w:t>Thinking · s1_case_student_path_reveal</w:t>
+            </w:r>
+          </w:p>
+          <w:p>
+            <w:pPr>
+              <w:spacing w:after="0"/>
+            </w:pPr>
+            <w:r>
+              <w:rPr>
+                <w:rFonts w:ascii="Aptos" w:hAnsi="Aptos"/>
+                <w:b/>
+                <w:color w:val="9A5B00"/>
+                <w:sz w:val="16"/>
+              </w:rPr>
+              <w:t>REVIEW WORDING</w:t>
             </w:r>
           </w:p>
         </w:tc>
@@ -2232,7 +2636,137 @@
                 <w:color w:val="14233B"/>
                 <w:sz w:val="23"/>
               </w:rPr>
-              <w:t>That is a useful answer too. Predicting before you look helps you notice what Claude changes, misses, or invents instead of just accepting the shiny paragraph.</w:t>
+              <w:t>That is the student-view test: can the learner follow the intended path without extra explanation from the instructor?</w:t>
+            </w:r>
+          </w:p>
+        </w:tc>
+      </w:tr>
+    </w:tbl>
+    <w:p>
+      <w:pPr>
+        <w:spacing w:after="20"/>
+      </w:pPr>
+    </w:p>
+    <w:p>
+      <w:pPr>
+        <w:spacing w:before="160" w:after="100"/>
+      </w:pPr>
+      <w:r>
+        <w:rPr>
+          <w:rFonts w:ascii="Aptos Display" w:hAnsi="Aptos Display"/>
+          <w:b/>
+          <w:color w:val="0B2348"/>
+          <w:sz w:val="30"/>
+        </w:rPr>
+        <w:t>Case 3: Assignment</w:t>
+      </w:r>
+    </w:p>
+    <w:tbl>
+      <w:tblPr>
+        <w:tblW w:type="auto" w:w="0"/>
+        <w:jc w:val="center"/>
+        <w:tblLayout w:type="fixed"/>
+        <w:tblLook w:firstColumn="1" w:firstRow="1" w:lastColumn="0" w:lastRow="0" w:noHBand="0" w:noVBand="1" w:val="04A0"/>
+      </w:tblPr>
+      <w:tblGrid>
+        <w:gridCol w:w="3096"/>
+        <w:gridCol w:w="6984"/>
+      </w:tblGrid>
+      <w:tr>
+        <w:trPr>
+          <w:cantSplit/>
+        </w:trPr>
+        <w:tc>
+          <w:tcPr>
+            <w:tcW w:type="dxa" w:w="5112"/>
+            <w:shd w:fill="FBF7ED"/>
+            <w:vAlign w:val="top"/>
+            <w:tcBorders>
+              <w:top w:val="single" w:sz="6" w:color="C8D5E3"/>
+              <w:start w:val="single" w:sz="6" w:color="C8D5E3"/>
+              <w:bottom w:val="single" w:sz="6" w:color="C8D5E3"/>
+              <w:end w:val="single" w:sz="6" w:color="C8D5E3"/>
+            </w:tcBorders>
+          </w:tcPr>
+          <w:p>
+            <w:pPr>
+              <w:spacing w:after="40"/>
+            </w:pPr>
+            <w:r>
+              <w:rPr>
+                <w:rFonts w:ascii="Aptos" w:hAnsi="Aptos"/>
+                <w:b/>
+                <w:color w:val="0B2348"/>
+                <w:sz w:val="20"/>
+              </w:rPr>
+              <w:t>22 · p-s1-case-03a</w:t>
+            </w:r>
+          </w:p>
+          <w:p>
+            <w:pPr>
+              <w:spacing w:after="20"/>
+            </w:pPr>
+            <w:r>
+              <w:rPr>
+                <w:rFonts w:ascii="Aptos" w:hAnsi="Aptos"/>
+                <w:b/>
+                <w:color w:val="1178B5"/>
+                <w:sz w:val="18"/>
+              </w:rPr>
+              <w:t>p-s1-case-03a.mp3</w:t>
+            </w:r>
+          </w:p>
+          <w:p>
+            <w:pPr>
+              <w:spacing w:after="20"/>
+            </w:pPr>
+            <w:r>
+              <w:rPr>
+                <w:rFonts w:ascii="Aptos" w:hAnsi="Aptos"/>
+                <w:color w:val="61748A"/>
+                <w:sz w:val="17"/>
+              </w:rPr>
+              <w:t>Thinking · s1_case_assignment_briefing</w:t>
+            </w:r>
+          </w:p>
+          <w:p>
+            <w:pPr>
+              <w:spacing w:after="0"/>
+            </w:pPr>
+            <w:r>
+              <w:rPr>
+                <w:rFonts w:ascii="Aptos" w:hAnsi="Aptos"/>
+                <w:b/>
+                <w:color w:val="9A5B00"/>
+                <w:sz w:val="16"/>
+              </w:rPr>
+              <w:t>REVIEW WORDING</w:t>
+            </w:r>
+          </w:p>
+        </w:tc>
+        <w:tc>
+          <w:tcPr>
+            <w:tcW w:type="dxa" w:w="5112"/>
+            <w:shd w:fill="FFFFFF"/>
+            <w:vAlign w:val="top"/>
+            <w:tcBorders>
+              <w:top w:val="single" w:sz="6" w:color="C8D5E3"/>
+              <w:start w:val="single" w:sz="6" w:color="C8D5E3"/>
+              <w:bottom w:val="single" w:sz="6" w:color="C8D5E3"/>
+              <w:end w:val="single" w:sz="6" w:color="C8D5E3"/>
+            </w:tcBorders>
+          </w:tcPr>
+          <w:p>
+            <w:pPr>
+              <w:spacing w:after="0"/>
+            </w:pPr>
+            <w:r>
+              <w:rPr>
+                <w:rFonts w:ascii="Aptos" w:hAnsi="Aptos"/>
+                <w:color w:val="14233B"/>
+                <w:sz w:val="23"/>
+              </w:rPr>
+              <w:t>Case file 3 of 4: the assignment at the point of submission. Can Eli see what a successful comparison must include before he begins writing?</w:t>
             </w:r>
           </w:p>
         </w:tc>
@@ -2281,7 +2815,7 @@
                 <w:color w:val="0B2348"/>
                 <w:sz w:val="20"/>
               </w:rPr>
-              <w:t>21 · p54</w:t>
+              <w:t>23 · p-s1-case-03c</w:t>
             </w:r>
           </w:p>
           <w:p>
@@ -2295,7 +2829,7 @@
                 <w:color w:val="1178B5"/>
                 <w:sz w:val="18"/>
               </w:rPr>
-              <w:t>p54.mp3</w:t>
+              <w:t>p-s1-case-03c.mp3</w:t>
             </w:r>
           </w:p>
           <w:p>
@@ -2308,7 +2842,21 @@
                 <w:color w:val="61748A"/>
                 <w:sz w:val="17"/>
               </w:rPr>
-              <w:t>Thinking · pixel_dynamic_feedback_fallback</w:t>
+              <w:t>Encouraging · s1_case_assignment_briefing</w:t>
+            </w:r>
+          </w:p>
+          <w:p>
+            <w:pPr>
+              <w:spacing w:after="0"/>
+            </w:pPr>
+            <w:r>
+              <w:rPr>
+                <w:rFonts w:ascii="Aptos" w:hAnsi="Aptos"/>
+                <w:b/>
+                <w:color w:val="9A5B00"/>
+                <w:sz w:val="16"/>
+              </w:rPr>
+              <w:t>REVIEW WORDING</w:t>
             </w:r>
           </w:p>
         </w:tc>
@@ -2334,7 +2882,7 @@
                 <w:color w:val="14233B"/>
                 <w:sz w:val="23"/>
               </w:rPr>
-              <w:t>Hmm, I lost my train of thought — take a look at the Prompt Analysis panel and try another attempt.</w:t>
+              <w:t>Your inspection: list the requirements missing from this page and notice how much reconstruction the learner must do before submitting.</w:t>
             </w:r>
           </w:p>
         </w:tc>
@@ -2383,7 +2931,7 @@
                 <w:color w:val="0B2348"/>
                 <w:sz w:val="20"/>
               </w:rPr>
-              <w:t>22 · p58</w:t>
+              <w:t>24 · p-s1-case-03e</w:t>
             </w:r>
           </w:p>
           <w:p>
@@ -2397,7 +2945,7 @@
                 <w:color w:val="1178B5"/>
                 <w:sz w:val="18"/>
               </w:rPr>
-              <w:t>p58.mp3</w:t>
+              <w:t>p-s1-case-03e.mp3</w:t>
             </w:r>
           </w:p>
           <w:p>
@@ -2410,7 +2958,21 @@
                 <w:color w:val="61748A"/>
                 <w:sz w:val="17"/>
               </w:rPr>
-              <w:t>Natural · claude_analyzing_bridge_1</w:t>
+              <w:t>Encouraging · s1_case_assignment_explanation</w:t>
+            </w:r>
+          </w:p>
+          <w:p>
+            <w:pPr>
+              <w:spacing w:after="0"/>
+            </w:pPr>
+            <w:r>
+              <w:rPr>
+                <w:rFonts w:ascii="Aptos" w:hAnsi="Aptos"/>
+                <w:b/>
+                <w:color w:val="9A5B00"/>
+                <w:sz w:val="16"/>
+              </w:rPr>
+              <w:t>REVIEW WORDING</w:t>
             </w:r>
           </w:p>
         </w:tc>
@@ -2436,7 +2998,7 @@
                 <w:color w:val="14233B"/>
                 <w:sz w:val="23"/>
               </w:rPr>
-              <w:t>Let's ask Claude what it notices.</w:t>
+              <w:t>That hunt is avoidable. Before the After view, we will ask Babbage to extract the scattered requirements, verify every item against the source, and decide what belongs at the point of need.</w:t>
             </w:r>
           </w:p>
         </w:tc>
@@ -2485,7 +3047,7 @@
                 <w:color w:val="0B2348"/>
                 <w:sz w:val="20"/>
               </w:rPr>
-              <w:t>23 · p59</w:t>
+              <w:t>25 · p-s1-case-03ai-a</w:t>
             </w:r>
           </w:p>
           <w:p>
@@ -2499,7 +3061,7 @@
                 <w:color w:val="1178B5"/>
                 <w:sz w:val="18"/>
               </w:rPr>
-              <w:t>p59.mp3</w:t>
+              <w:t>p-s1-case-03ai-a.mp3</w:t>
             </w:r>
           </w:p>
           <w:p>
@@ -2512,7 +3074,21 @@
                 <w:color w:val="61748A"/>
                 <w:sz w:val="17"/>
               </w:rPr>
-              <w:t>Natural · claude_analyzing_bridge_2</w:t>
+              <w:t>Thinking · s1_case_assignment_ai_demo</w:t>
+            </w:r>
+          </w:p>
+          <w:p>
+            <w:pPr>
+              <w:spacing w:after="0"/>
+            </w:pPr>
+            <w:r>
+              <w:rPr>
+                <w:rFonts w:ascii="Aptos" w:hAnsi="Aptos"/>
+                <w:b/>
+                <w:color w:val="9A5B00"/>
+                <w:sz w:val="16"/>
+              </w:rPr>
+              <w:t>REVIEW WORDING</w:t>
             </w:r>
           </w:p>
         </w:tc>
@@ -2538,7 +3114,7 @@
                 <w:color w:val="14233B"/>
                 <w:sz w:val="23"/>
               </w:rPr>
-              <w:t>Claude is analyzing the teaching problem now.</w:t>
+              <w:t>We can give Babbage the assignment page and related module directions with a narrow instruction: extract the requirements, cite where each one appears, and do not invent missing criteria.</w:t>
             </w:r>
           </w:p>
         </w:tc>
@@ -2587,7 +3163,7 @@
                 <w:color w:val="0B2348"/>
                 <w:sz w:val="20"/>
               </w:rPr>
-              <w:t>24 · p60</w:t>
+              <w:t>26 · p-s1-case-03ai-c</w:t>
             </w:r>
           </w:p>
           <w:p>
@@ -2601,7 +3177,7 @@
                 <w:color w:val="1178B5"/>
                 <w:sz w:val="18"/>
               </w:rPr>
-              <w:t>p60.mp3</w:t>
+              <w:t>p-s1-case-03ai-c.mp3</w:t>
             </w:r>
           </w:p>
           <w:p>
@@ -2614,7 +3190,21 @@
                 <w:color w:val="61748A"/>
                 <w:sz w:val="17"/>
               </w:rPr>
-              <w:t>Thinking · prediction_gate_intro_1</w:t>
+              <w:t>Encouraging · s1_case_assignment_ai_demo</w:t>
+            </w:r>
+          </w:p>
+          <w:p>
+            <w:pPr>
+              <w:spacing w:after="0"/>
+            </w:pPr>
+            <w:r>
+              <w:rPr>
+                <w:rFonts w:ascii="Aptos" w:hAnsi="Aptos"/>
+                <w:b/>
+                <w:color w:val="9A5B00"/>
+                <w:sz w:val="16"/>
+              </w:rPr>
+              <w:t>REVIEW WORDING</w:t>
             </w:r>
           </w:p>
         </w:tc>
@@ -2640,7 +3230,7 @@
                 <w:color w:val="14233B"/>
                 <w:sz w:val="23"/>
               </w:rPr>
-              <w:t>Before we consult Claude...</w:t>
+              <w:t>The instructor must compare every extracted requirement to the source and decide what counts as successful evidence before publishing the revision.</w:t>
             </w:r>
           </w:p>
         </w:tc>
@@ -2689,7 +3279,7 @@
                 <w:color w:val="0B2348"/>
                 <w:sz w:val="20"/>
               </w:rPr>
-              <w:t>25 · p61</w:t>
+              <w:t>27 · p-s1-case-03g</w:t>
             </w:r>
           </w:p>
           <w:p>
@@ -2703,7 +3293,7 @@
                 <w:color w:val="1178B5"/>
                 <w:sz w:val="18"/>
               </w:rPr>
-              <w:t>p61.mp3</w:t>
+              <w:t>p-s1-case-03g.mp3</w:t>
             </w:r>
           </w:p>
           <w:p>
@@ -2716,7 +3306,21 @@
                 <w:color w:val="61748A"/>
                 <w:sz w:val="17"/>
               </w:rPr>
-              <w:t>Thinking · prediction_gate_intro_2</w:t>
+              <w:t>Encouraging · s1_case_assignment_reveal</w:t>
+            </w:r>
+          </w:p>
+          <w:p>
+            <w:pPr>
+              <w:spacing w:after="0"/>
+            </w:pPr>
+            <w:r>
+              <w:rPr>
+                <w:rFonts w:ascii="Aptos" w:hAnsi="Aptos"/>
+                <w:b/>
+                <w:color w:val="9A5B00"/>
+                <w:sz w:val="16"/>
+              </w:rPr>
+              <w:t>REVIEW WORDING</w:t>
             </w:r>
           </w:p>
         </w:tc>
@@ -2742,7 +3346,137 @@
                 <w:color w:val="14233B"/>
                 <w:sz w:val="23"/>
               </w:rPr>
-              <w:t>Based on the context you gave, what do you predict Claude will do?</w:t>
+              <w:t>The After view reduces reconstruction. Students can spend their effort on the comparison instead of searching for the assignment.</w:t>
+            </w:r>
+          </w:p>
+        </w:tc>
+      </w:tr>
+    </w:tbl>
+    <w:p>
+      <w:pPr>
+        <w:spacing w:after="20"/>
+      </w:pPr>
+    </w:p>
+    <w:p>
+      <w:pPr>
+        <w:spacing w:before="160" w:after="100"/>
+      </w:pPr>
+      <w:r>
+        <w:rPr>
+          <w:rFonts w:ascii="Aptos Display" w:hAnsi="Aptos Display"/>
+          <w:b/>
+          <w:color w:val="0B2348"/>
+          <w:sz w:val="30"/>
+        </w:rPr>
+        <w:t>Case 4: Expectations</w:t>
+      </w:r>
+    </w:p>
+    <w:tbl>
+      <w:tblPr>
+        <w:tblW w:type="auto" w:w="0"/>
+        <w:jc w:val="center"/>
+        <w:tblLayout w:type="fixed"/>
+        <w:tblLook w:firstColumn="1" w:firstRow="1" w:lastColumn="0" w:lastRow="0" w:noHBand="0" w:noVBand="1" w:val="04A0"/>
+      </w:tblPr>
+      <w:tblGrid>
+        <w:gridCol w:w="3096"/>
+        <w:gridCol w:w="6984"/>
+      </w:tblGrid>
+      <w:tr>
+        <w:trPr>
+          <w:cantSplit/>
+        </w:trPr>
+        <w:tc>
+          <w:tcPr>
+            <w:tcW w:type="dxa" w:w="5112"/>
+            <w:shd w:fill="FBF7ED"/>
+            <w:vAlign w:val="top"/>
+            <w:tcBorders>
+              <w:top w:val="single" w:sz="6" w:color="C8D5E3"/>
+              <w:start w:val="single" w:sz="6" w:color="C8D5E3"/>
+              <w:bottom w:val="single" w:sz="6" w:color="C8D5E3"/>
+              <w:end w:val="single" w:sz="6" w:color="C8D5E3"/>
+            </w:tcBorders>
+          </w:tcPr>
+          <w:p>
+            <w:pPr>
+              <w:spacing w:after="40"/>
+            </w:pPr>
+            <w:r>
+              <w:rPr>
+                <w:rFonts w:ascii="Aptos" w:hAnsi="Aptos"/>
+                <w:b/>
+                <w:color w:val="0B2348"/>
+                <w:sz w:val="20"/>
+              </w:rPr>
+              <w:t>28 · p-s1-case-04a</w:t>
+            </w:r>
+          </w:p>
+          <w:p>
+            <w:pPr>
+              <w:spacing w:after="20"/>
+            </w:pPr>
+            <w:r>
+              <w:rPr>
+                <w:rFonts w:ascii="Aptos" w:hAnsi="Aptos"/>
+                <w:b/>
+                <w:color w:val="1178B5"/>
+                <w:sz w:val="18"/>
+              </w:rPr>
+              <w:t>p-s1-case-04a.mp3</w:t>
+            </w:r>
+          </w:p>
+          <w:p>
+            <w:pPr>
+              <w:spacing w:after="20"/>
+            </w:pPr>
+            <w:r>
+              <w:rPr>
+                <w:rFonts w:ascii="Aptos" w:hAnsi="Aptos"/>
+                <w:color w:val="61748A"/>
+                <w:sz w:val="17"/>
+              </w:rPr>
+              <w:t>Thinking · s1_case_expectations_briefing</w:t>
+            </w:r>
+          </w:p>
+          <w:p>
+            <w:pPr>
+              <w:spacing w:after="0"/>
+            </w:pPr>
+            <w:r>
+              <w:rPr>
+                <w:rFonts w:ascii="Aptos" w:hAnsi="Aptos"/>
+                <w:b/>
+                <w:color w:val="9A5B00"/>
+                <w:sz w:val="16"/>
+              </w:rPr>
+              <w:t>REVIEW WORDING</w:t>
+            </w:r>
+          </w:p>
+        </w:tc>
+        <w:tc>
+          <w:tcPr>
+            <w:tcW w:type="dxa" w:w="5112"/>
+            <w:shd w:fill="FFFFFF"/>
+            <w:vAlign w:val="top"/>
+            <w:tcBorders>
+              <w:top w:val="single" w:sz="6" w:color="C8D5E3"/>
+              <w:start w:val="single" w:sz="6" w:color="C8D5E3"/>
+              <w:bottom w:val="single" w:sz="6" w:color="C8D5E3"/>
+              <w:end w:val="single" w:sz="6" w:color="C8D5E3"/>
+            </w:tcBorders>
+          </w:tcPr>
+          <w:p>
+            <w:pPr>
+              <w:spacing w:after="0"/>
+            </w:pPr>
+            <w:r>
+              <w:rPr>
+                <w:rFonts w:ascii="Aptos" w:hAnsi="Aptos"/>
+                <w:color w:val="14233B"/>
+                <w:sz w:val="23"/>
+              </w:rPr>
+              <w:t>Case file 4 of 4: expectations at the point of need. The directions exist, but how quickly can Eli find the purpose, workload, deadline, evidence, and required sequence?</w:t>
             </w:r>
           </w:p>
         </w:tc>
@@ -2791,7 +3525,7 @@
                 <w:color w:val="0B2348"/>
                 <w:sz w:val="20"/>
               </w:rPr>
-              <w:t>26 · p62</w:t>
+              <w:t>29 · p-s1-case-04c</w:t>
             </w:r>
           </w:p>
           <w:p>
@@ -2805,7 +3539,7 @@
                 <w:color w:val="1178B5"/>
                 <w:sz w:val="18"/>
               </w:rPr>
-              <w:t>p62.mp3</w:t>
+              <w:t>p-s1-case-04c.mp3</w:t>
             </w:r>
           </w:p>
           <w:p>
@@ -2818,7 +3552,21 @@
                 <w:color w:val="61748A"/>
                 <w:sz w:val="17"/>
               </w:rPr>
-              <w:t>Natural · prediction_logged</w:t>
+              <w:t>Encouraging · s1_case_expectations_briefing</w:t>
+            </w:r>
+          </w:p>
+          <w:p>
+            <w:pPr>
+              <w:spacing w:after="0"/>
+            </w:pPr>
+            <w:r>
+              <w:rPr>
+                <w:rFonts w:ascii="Aptos" w:hAnsi="Aptos"/>
+                <w:b/>
+                <w:color w:val="9A5B00"/>
+                <w:sz w:val="16"/>
+              </w:rPr>
+              <w:t>REVIEW WORDING</w:t>
             </w:r>
           </w:p>
         </w:tc>
@@ -2844,123 +3592,7 @@
                 <w:color w:val="14233B"/>
                 <w:sz w:val="23"/>
               </w:rPr>
-              <w:t>Your prediction is logged.</w:t>
-            </w:r>
-          </w:p>
-        </w:tc>
-      </w:tr>
-    </w:tbl>
-    <w:p>
-      <w:pPr>
-        <w:spacing w:after="20"/>
-      </w:pPr>
-    </w:p>
-    <w:p>
-      <w:pPr>
-        <w:spacing w:before="160" w:after="100"/>
-      </w:pPr>
-      <w:r>
-        <w:rPr>
-          <w:rFonts w:ascii="Aptos Display" w:hAnsi="Aptos Display"/>
-          <w:b/>
-          <w:color w:val="0B2348"/>
-          <w:sz w:val="30"/>
-        </w:rPr>
-        <w:t>Scenario 1 score reactions</w:t>
-      </w:r>
-    </w:p>
-    <w:tbl>
-      <w:tblPr>
-        <w:tblW w:type="auto" w:w="0"/>
-        <w:jc w:val="center"/>
-        <w:tblLayout w:type="fixed"/>
-        <w:tblLook w:firstColumn="1" w:firstRow="1" w:lastColumn="0" w:lastRow="0" w:noHBand="0" w:noVBand="1" w:val="04A0"/>
-      </w:tblPr>
-      <w:tblGrid>
-        <w:gridCol w:w="3096"/>
-        <w:gridCol w:w="6984"/>
-      </w:tblGrid>
-      <w:tr>
-        <w:trPr>
-          <w:cantSplit/>
-        </w:trPr>
-        <w:tc>
-          <w:tcPr>
-            <w:tcW w:type="dxa" w:w="5112"/>
-            <w:shd w:fill="FBF7ED"/>
-            <w:vAlign w:val="top"/>
-            <w:tcBorders>
-              <w:top w:val="single" w:sz="6" w:color="C8D5E3"/>
-              <w:start w:val="single" w:sz="6" w:color="C8D5E3"/>
-              <w:bottom w:val="single" w:sz="6" w:color="C8D5E3"/>
-              <w:end w:val="single" w:sz="6" w:color="C8D5E3"/>
-            </w:tcBorders>
-          </w:tcPr>
-          <w:p>
-            <w:pPr>
-              <w:spacing w:after="40"/>
-            </w:pPr>
-            <w:r>
-              <w:rPr>
-                <w:rFonts w:ascii="Aptos" w:hAnsi="Aptos"/>
-                <w:b/>
-                <w:color w:val="0B2348"/>
-                <w:sz w:val="20"/>
-              </w:rPr>
-              <w:t>27 · s1-score-0-a</w:t>
-            </w:r>
-          </w:p>
-          <w:p>
-            <w:pPr>
-              <w:spacing w:after="20"/>
-            </w:pPr>
-            <w:r>
-              <w:rPr>
-                <w:rFonts w:ascii="Aptos" w:hAnsi="Aptos"/>
-                <w:b/>
-                <w:color w:val="1178B5"/>
-                <w:sz w:val="18"/>
-              </w:rPr>
-              <w:t>s1-score-0-a.mp3</w:t>
-            </w:r>
-          </w:p>
-          <w:p>
-            <w:pPr>
-              <w:spacing w:after="20"/>
-            </w:pPr>
-            <w:r>
-              <w:rPr>
-                <w:rFonts w:ascii="Aptos" w:hAnsi="Aptos"/>
-                <w:color w:val="61748A"/>
-                <w:sz w:val="17"/>
-              </w:rPr>
-              <w:t>Skeptical · scoreReflection_0</w:t>
-            </w:r>
-          </w:p>
-        </w:tc>
-        <w:tc>
-          <w:tcPr>
-            <w:tcW w:type="dxa" w:w="5112"/>
-            <w:shd w:fill="FFFFFF"/>
-            <w:vAlign w:val="top"/>
-            <w:tcBorders>
-              <w:top w:val="single" w:sz="6" w:color="C8D5E3"/>
-              <w:start w:val="single" w:sz="6" w:color="C8D5E3"/>
-              <w:bottom w:val="single" w:sz="6" w:color="C8D5E3"/>
-              <w:end w:val="single" w:sz="6" w:color="C8D5E3"/>
-            </w:tcBorders>
-          </w:tcPr>
-          <w:p>
-            <w:pPr>
-              <w:spacing w:after="0"/>
-            </w:pPr>
-            <w:r>
-              <w:rPr>
-                <w:rFonts w:ascii="Aptos" w:hAnsi="Aptos"/>
-                <w:color w:val="14233B"/>
-                <w:sz w:val="23"/>
-              </w:rPr>
-              <w:t>That landed at zero out of five. I am not going to pretend Claude had a usable design brief here. The response either missed the scenario or gave us information we cannot responsibly design from.</w:t>
+              <w:t>Your inspection: find which expectations arrive too late, then reveal how a Start Here page changes the planning experience.</w:t>
             </w:r>
           </w:p>
         </w:tc>
@@ -3009,7 +3641,7 @@
                 <w:color w:val="0B2348"/>
                 <w:sz w:val="20"/>
               </w:rPr>
-              <w:t>28 · s1-score-0-b</w:t>
+              <w:t>30 · p-s1-case-04e</w:t>
             </w:r>
           </w:p>
           <w:p>
@@ -3023,7 +3655,7 @@
                 <w:color w:val="1178B5"/>
                 <w:sz w:val="18"/>
               </w:rPr>
-              <w:t>s1-score-0-b.mp3</w:t>
+              <w:t>p-s1-case-04e.mp3</w:t>
             </w:r>
           </w:p>
           <w:p>
@@ -3036,7 +3668,21 @@
                 <w:color w:val="61748A"/>
                 <w:sz w:val="17"/>
               </w:rPr>
-              <w:t>Thinking · scoreReflection_0</w:t>
+              <w:t>Encouraging · s1_case_expectations_explanation</w:t>
+            </w:r>
+          </w:p>
+          <w:p>
+            <w:pPr>
+              <w:spacing w:after="0"/>
+            </w:pPr>
+            <w:r>
+              <w:rPr>
+                <w:rFonts w:ascii="Aptos" w:hAnsi="Aptos"/>
+                <w:b/>
+                <w:color w:val="9A5B00"/>
+                <w:sz w:val="16"/>
+              </w:rPr>
+              <w:t>REVIEW WORDING</w:t>
             </w:r>
           </w:p>
         </w:tc>
@@ -3062,7 +3708,7 @@
                 <w:color w:val="14233B"/>
                 <w:sz w:val="23"/>
               </w:rPr>
-              <w:t>A useful repair needs a real learner context, a specific interaction problem, a meaningful interaction move, practical constraints, and some sign of what success should look like.</w:t>
+              <w:t>Exactly. Before we reveal the Start Here repair, we will give Babbage the verified details, review its draft organizer, and decide what the instructor can safely publish.</w:t>
             </w:r>
           </w:p>
         </w:tc>
@@ -3111,7 +3757,7 @@
                 <w:color w:val="0B2348"/>
                 <w:sz w:val="20"/>
               </w:rPr>
-              <w:t>29 · s1-score-0-c</w:t>
+              <w:t>31 · p-s1-case-04ai-a</w:t>
             </w:r>
           </w:p>
           <w:p>
@@ -3125,7 +3771,7 @@
                 <w:color w:val="1178B5"/>
                 <w:sz w:val="18"/>
               </w:rPr>
-              <w:t>s1-score-0-c.mp3</w:t>
+              <w:t>p-s1-case-04ai-a.mp3</w:t>
             </w:r>
           </w:p>
           <w:p>
@@ -3138,7 +3784,21 @@
                 <w:color w:val="61748A"/>
                 <w:sz w:val="17"/>
               </w:rPr>
-              <w:t>Encouraging · scoreReflection_0</w:t>
+              <w:t>Thinking · s1_case_expectations_ai_demo</w:t>
+            </w:r>
+          </w:p>
+          <w:p>
+            <w:pPr>
+              <w:spacing w:after="0"/>
+            </w:pPr>
+            <w:r>
+              <w:rPr>
+                <w:rFonts w:ascii="Aptos" w:hAnsi="Aptos"/>
+                <w:b/>
+                <w:color w:val="9A5B00"/>
+                <w:sz w:val="16"/>
+              </w:rPr>
+              <w:t>REVIEW WORDING</w:t>
             </w:r>
           </w:p>
         </w:tc>
@@ -3164,7 +3824,7 @@
                 <w:color w:val="14233B"/>
                 <w:sz w:val="23"/>
               </w:rPr>
-              <w:t>Go back to the repair notes and rebuild the foundation. Give Claude instructional information, not filler, and the next analysis should change substantially.</w:t>
+              <w:t>Once the details are verified, AI can convert them into a first-draft Start Here page with the destination, sequence, workload, due point, and next action.</w:t>
             </w:r>
           </w:p>
         </w:tc>
@@ -3213,7 +3873,7 @@
                 <w:color w:val="0B2348"/>
                 <w:sz w:val="20"/>
               </w:rPr>
-              <w:t>30 · s1-score-1-a</w:t>
+              <w:t>32 · p-s1-case-04ai-c</w:t>
             </w:r>
           </w:p>
           <w:p>
@@ -3227,7 +3887,7 @@
                 <w:color w:val="1178B5"/>
                 <w:sz w:val="18"/>
               </w:rPr>
-              <w:t>s1-score-1-a.mp3</w:t>
+              <w:t>p-s1-case-04ai-c.mp3</w:t>
             </w:r>
           </w:p>
           <w:p>
@@ -3240,7 +3900,21 @@
                 <w:color w:val="61748A"/>
                 <w:sz w:val="17"/>
               </w:rPr>
-              <w:t>Skeptical · scoreReflection_1</w:t>
+              <w:t>Encouraging · s1_case_expectations_ai_demo</w:t>
+            </w:r>
+          </w:p>
+          <w:p>
+            <w:pPr>
+              <w:spacing w:after="0"/>
+            </w:pPr>
+            <w:r>
+              <w:rPr>
+                <w:rFonts w:ascii="Aptos" w:hAnsi="Aptos"/>
+                <w:b/>
+                <w:color w:val="9A5B00"/>
+                <w:sz w:val="16"/>
+              </w:rPr>
+              <w:t>REVIEW WORDING</w:t>
             </w:r>
           </w:p>
         </w:tc>
@@ -3266,7 +3940,7 @@
                 <w:color w:val="14233B"/>
                 <w:sz w:val="23"/>
               </w:rPr>
-              <w:t>That scored one out of five. There is one usable signal in the response, but Claude is still being asked to fill in most of the instructional design for you.</w:t>
+              <w:t>Exactly. Babbage accelerates the first pass. Instructor review turns that draft into trustworthy course design.</w:t>
             </w:r>
           </w:p>
         </w:tc>
@@ -3315,7 +3989,7 @@
                 <w:color w:val="0B2348"/>
                 <w:sz w:val="20"/>
               </w:rPr>
-              <w:t>31 · s1-score-1-b</w:t>
+              <w:t>33 · p-s1-case-04g</w:t>
             </w:r>
           </w:p>
           <w:p>
@@ -3329,7 +4003,7 @@
                 <w:color w:val="1178B5"/>
                 <w:sz w:val="18"/>
               </w:rPr>
-              <w:t>s1-score-1-b.mp3</w:t>
+              <w:t>p-s1-case-04g.mp3</w:t>
             </w:r>
           </w:p>
           <w:p>
@@ -3342,7 +4016,21 @@
                 <w:color w:val="61748A"/>
                 <w:sz w:val="17"/>
               </w:rPr>
-              <w:t>Thinking · scoreReflection_1</w:t>
+              <w:t>Thinking · s1_case_expectations_reveal</w:t>
+            </w:r>
+          </w:p>
+          <w:p>
+            <w:pPr>
+              <w:spacing w:after="0"/>
+            </w:pPr>
+            <w:r>
+              <w:rPr>
+                <w:rFonts w:ascii="Aptos" w:hAnsi="Aptos"/>
+                <w:b/>
+                <w:color w:val="9A5B00"/>
+                <w:sz w:val="16"/>
+              </w:rPr>
+              <w:t>REVIEW WORDING</w:t>
             </w:r>
           </w:p>
         </w:tc>
@@ -3368,7 +4056,7 @@
                 <w:color w:val="14233B"/>
                 <w:sz w:val="23"/>
               </w:rPr>
-              <w:t>When the design brief is this thin, even a polished AI response can look smarter than the reasoning underneath it. That is exactly the trap this scenario is trying to expose.</w:t>
+              <w:t>The redesign moves expectations forward. That small shift makes the whole module easier to plan and navigate.</w:t>
             </w:r>
           </w:p>
         </w:tc>
@@ -3417,7 +4105,7 @@
                 <w:color w:val="0B2348"/>
                 <w:sz w:val="20"/>
               </w:rPr>
-              <w:t>32 · s1-score-1-c</w:t>
+              <w:t>34 · p-s1-case-04h</w:t>
             </w:r>
           </w:p>
           <w:p>
@@ -3431,7 +4119,7 @@
                 <w:color w:val="1178B5"/>
                 <w:sz w:val="18"/>
               </w:rPr>
-              <w:t>s1-score-1-c.mp3</w:t>
+              <w:t>p-s1-case-04h.mp3</w:t>
             </w:r>
           </w:p>
           <w:p>
@@ -3444,7 +4132,21 @@
                 <w:color w:val="61748A"/>
                 <w:sz w:val="17"/>
               </w:rPr>
-              <w:t>Encouraging · scoreReflection_1</w:t>
+              <w:t>Encouraging · s1_case_expectations_reveal</w:t>
+            </w:r>
+          </w:p>
+          <w:p>
+            <w:pPr>
+              <w:spacing w:after="0"/>
+            </w:pPr>
+            <w:r>
+              <w:rPr>
+                <w:rFonts w:ascii="Aptos" w:hAnsi="Aptos"/>
+                <w:b/>
+                <w:color w:val="9A5B00"/>
+                <w:sz w:val="16"/>
+              </w:rPr>
+              <w:t>REVIEW WORDING</w:t>
             </w:r>
           </w:p>
         </w:tc>
@@ -3470,7 +4172,137 @@
                 <w:color w:val="14233B"/>
                 <w:sz w:val="23"/>
               </w:rPr>
-              <w:t>Strengthen the repair notes before you move on. Make the problem and the interaction you want students to have much more concrete.</w:t>
+              <w:t>You have now inspected all four repairs. Return to the evidence station and start the Canvas Rescue to build the brief Babbage will actually use.</w:t>
+            </w:r>
+          </w:p>
+        </w:tc>
+      </w:tr>
+    </w:tbl>
+    <w:p>
+      <w:pPr>
+        <w:spacing w:after="20"/>
+      </w:pPr>
+    </w:p>
+    <w:p>
+      <w:pPr>
+        <w:spacing w:before="160" w:after="100"/>
+      </w:pPr>
+      <w:r>
+        <w:rPr>
+          <w:rFonts w:ascii="Aptos Display" w:hAnsi="Aptos Display"/>
+          <w:b/>
+          <w:color w:val="0B2348"/>
+          <w:sz w:val="30"/>
+        </w:rPr>
+        <w:t>Canvas Rescue complete</w:t>
+      </w:r>
+    </w:p>
+    <w:tbl>
+      <w:tblPr>
+        <w:tblW w:type="auto" w:w="0"/>
+        <w:jc w:val="center"/>
+        <w:tblLayout w:type="fixed"/>
+        <w:tblLook w:firstColumn="1" w:firstRow="1" w:lastColumn="0" w:lastRow="0" w:noHBand="0" w:noVBand="1" w:val="04A0"/>
+      </w:tblPr>
+      <w:tblGrid>
+        <w:gridCol w:w="3096"/>
+        <w:gridCol w:w="6984"/>
+      </w:tblGrid>
+      <w:tr>
+        <w:trPr>
+          <w:cantSplit/>
+        </w:trPr>
+        <w:tc>
+          <w:tcPr>
+            <w:tcW w:type="dxa" w:w="5112"/>
+            <w:shd w:fill="FBF7ED"/>
+            <w:vAlign w:val="top"/>
+            <w:tcBorders>
+              <w:top w:val="single" w:sz="6" w:color="C8D5E3"/>
+              <w:start w:val="single" w:sz="6" w:color="C8D5E3"/>
+              <w:bottom w:val="single" w:sz="6" w:color="C8D5E3"/>
+              <w:end w:val="single" w:sz="6" w:color="C8D5E3"/>
+            </w:tcBorders>
+          </w:tcPr>
+          <w:p>
+            <w:pPr>
+              <w:spacing w:after="40"/>
+            </w:pPr>
+            <w:r>
+              <w:rPr>
+                <w:rFonts w:ascii="Aptos" w:hAnsi="Aptos"/>
+                <w:b/>
+                <w:color w:val="0B2348"/>
+                <w:sz w:val="20"/>
+              </w:rPr>
+              <w:t>35 · p-s1-rescue-02</w:t>
+            </w:r>
+          </w:p>
+          <w:p>
+            <w:pPr>
+              <w:spacing w:after="20"/>
+            </w:pPr>
+            <w:r>
+              <w:rPr>
+                <w:rFonts w:ascii="Aptos" w:hAnsi="Aptos"/>
+                <w:b/>
+                <w:color w:val="1178B5"/>
+                <w:sz w:val="18"/>
+              </w:rPr>
+              <w:t>p-s1-rescue-02.mp3</w:t>
+            </w:r>
+          </w:p>
+          <w:p>
+            <w:pPr>
+              <w:spacing w:after="20"/>
+            </w:pPr>
+            <w:r>
+              <w:rPr>
+                <w:rFonts w:ascii="Aptos" w:hAnsi="Aptos"/>
+                <w:color w:val="61748A"/>
+                <w:sz w:val="17"/>
+              </w:rPr>
+              <w:t>Encouraging · s1_canvas_rescue_complete</w:t>
+            </w:r>
+          </w:p>
+          <w:p>
+            <w:pPr>
+              <w:spacing w:after="0"/>
+            </w:pPr>
+            <w:r>
+              <w:rPr>
+                <w:rFonts w:ascii="Aptos" w:hAnsi="Aptos"/>
+                <w:b/>
+                <w:color w:val="9A5B00"/>
+                <w:sz w:val="16"/>
+              </w:rPr>
+              <w:t>REVIEW WORDING</w:t>
+            </w:r>
+          </w:p>
+        </w:tc>
+        <w:tc>
+          <w:tcPr>
+            <w:tcW w:type="dxa" w:w="5112"/>
+            <w:shd w:fill="FFFFFF"/>
+            <w:vAlign w:val="top"/>
+            <w:tcBorders>
+              <w:top w:val="single" w:sz="6" w:color="C8D5E3"/>
+              <w:start w:val="single" w:sz="6" w:color="C8D5E3"/>
+              <w:bottom w:val="single" w:sz="6" w:color="C8D5E3"/>
+              <w:end w:val="single" w:sz="6" w:color="C8D5E3"/>
+            </w:tcBorders>
+          </w:tcPr>
+          <w:p>
+            <w:pPr>
+              <w:spacing w:after="0"/>
+            </w:pPr>
+            <w:r>
+              <w:rPr>
+                <w:rFonts w:ascii="Aptos" w:hAnsi="Aptos"/>
+                <w:color w:val="14233B"/>
+                <w:sz w:val="23"/>
+              </w:rPr>
+              <w:t>And from the instructor side, AI accelerated the inventory, extraction, and first draft without receiving authority to publish or invent course decisions.</w:t>
             </w:r>
           </w:p>
         </w:tc>
@@ -3519,7 +4351,7 @@
                 <w:color w:val="0B2348"/>
                 <w:sz w:val="20"/>
               </w:rPr>
-              <w:t>33 · s1-score-2-a</w:t>
+              <w:t>36 · p-s1-rescue-03</w:t>
             </w:r>
           </w:p>
           <w:p>
@@ -3533,7 +4365,7 @@
                 <w:color w:val="1178B5"/>
                 <w:sz w:val="18"/>
               </w:rPr>
-              <w:t>s1-score-2-a.mp3</w:t>
+              <w:t>p-s1-rescue-03.mp3</w:t>
             </w:r>
           </w:p>
           <w:p>
@@ -3546,7 +4378,21 @@
                 <w:color w:val="61748A"/>
                 <w:sz w:val="17"/>
               </w:rPr>
-              <w:t>Thinking · scoreReflection_2</w:t>
+              <w:t>Proud · s1_canvas_rescue_complete</w:t>
+            </w:r>
+          </w:p>
+          <w:p>
+            <w:pPr>
+              <w:spacing w:after="0"/>
+            </w:pPr>
+            <w:r>
+              <w:rPr>
+                <w:rFonts w:ascii="Aptos" w:hAnsi="Aptos"/>
+                <w:b/>
+                <w:color w:val="9A5B00"/>
+                <w:sz w:val="16"/>
+              </w:rPr>
+              <w:t>REVIEW WORDING</w:t>
             </w:r>
           </w:p>
         </w:tc>
@@ -3572,1129 +4418,7 @@
                 <w:color w:val="14233B"/>
                 <w:sz w:val="23"/>
               </w:rPr>
-              <w:t>Two out of five. Claude has enough to see part of your intent, but too much of the redesign is still guesswork.</w:t>
-            </w:r>
-          </w:p>
-        </w:tc>
-      </w:tr>
-    </w:tbl>
-    <w:p>
-      <w:pPr>
-        <w:spacing w:after="20"/>
-      </w:pPr>
-    </w:p>
-    <w:tbl>
-      <w:tblPr>
-        <w:tblW w:type="auto" w:w="0"/>
-        <w:jc w:val="center"/>
-        <w:tblLayout w:type="fixed"/>
-        <w:tblLook w:firstColumn="1" w:firstRow="1" w:lastColumn="0" w:lastRow="0" w:noHBand="0" w:noVBand="1" w:val="04A0"/>
-      </w:tblPr>
-      <w:tblGrid>
-        <w:gridCol w:w="3096"/>
-        <w:gridCol w:w="6984"/>
-      </w:tblGrid>
-      <w:tr>
-        <w:trPr>
-          <w:cantSplit/>
-        </w:trPr>
-        <w:tc>
-          <w:tcPr>
-            <w:tcW w:type="dxa" w:w="5112"/>
-            <w:shd w:fill="FBF7ED"/>
-            <w:vAlign w:val="top"/>
-            <w:tcBorders>
-              <w:top w:val="single" w:sz="6" w:color="C8D5E3"/>
-              <w:start w:val="single" w:sz="6" w:color="C8D5E3"/>
-              <w:bottom w:val="single" w:sz="6" w:color="C8D5E3"/>
-              <w:end w:val="single" w:sz="6" w:color="C8D5E3"/>
-            </w:tcBorders>
-          </w:tcPr>
-          <w:p>
-            <w:pPr>
-              <w:spacing w:after="40"/>
-            </w:pPr>
-            <w:r>
-              <w:rPr>
-                <w:rFonts w:ascii="Aptos" w:hAnsi="Aptos"/>
-                <w:b/>
-                <w:color w:val="0B2348"/>
-                <w:sz w:val="20"/>
-              </w:rPr>
-              <w:t>34 · s1-score-2-b</w:t>
-            </w:r>
-          </w:p>
-          <w:p>
-            <w:pPr>
-              <w:spacing w:after="20"/>
-            </w:pPr>
-            <w:r>
-              <w:rPr>
-                <w:rFonts w:ascii="Aptos" w:hAnsi="Aptos"/>
-                <w:b/>
-                <w:color w:val="1178B5"/>
-                <w:sz w:val="18"/>
-              </w:rPr>
-              <w:t>s1-score-2-b.mp3</w:t>
-            </w:r>
-          </w:p>
-          <w:p>
-            <w:pPr>
-              <w:spacing w:after="20"/>
-            </w:pPr>
-            <w:r>
-              <w:rPr>
-                <w:rFonts w:ascii="Aptos" w:hAnsi="Aptos"/>
-                <w:color w:val="61748A"/>
-                <w:sz w:val="17"/>
-              </w:rPr>
-              <w:t>Skeptical · scoreReflection_2</w:t>
-            </w:r>
-          </w:p>
-        </w:tc>
-        <w:tc>
-          <w:tcPr>
-            <w:tcW w:type="dxa" w:w="5112"/>
-            <w:shd w:fill="FFFFFF"/>
-            <w:vAlign w:val="top"/>
-            <w:tcBorders>
-              <w:top w:val="single" w:sz="6" w:color="C8D5E3"/>
-              <w:start w:val="single" w:sz="6" w:color="C8D5E3"/>
-              <w:bottom w:val="single" w:sz="6" w:color="C8D5E3"/>
-              <w:end w:val="single" w:sz="6" w:color="C8D5E3"/>
-            </w:tcBorders>
-          </w:tcPr>
-          <w:p>
-            <w:pPr>
-              <w:spacing w:after="0"/>
-            </w:pPr>
-            <w:r>
-              <w:rPr>
-                <w:rFonts w:ascii="Aptos" w:hAnsi="Aptos"/>
-                <w:color w:val="14233B"/>
-                <w:sz w:val="23"/>
-              </w:rPr>
-              <w:t>The important question is not whether the draft sounds better. It is whether your input gives Claude enough evidence to make the right instructional change instead of inventing one.</w:t>
-            </w:r>
-          </w:p>
-        </w:tc>
-      </w:tr>
-    </w:tbl>
-    <w:p>
-      <w:pPr>
-        <w:spacing w:after="20"/>
-      </w:pPr>
-    </w:p>
-    <w:tbl>
-      <w:tblPr>
-        <w:tblW w:type="auto" w:w="0"/>
-        <w:jc w:val="center"/>
-        <w:tblLayout w:type="fixed"/>
-        <w:tblLook w:firstColumn="1" w:firstRow="1" w:lastColumn="0" w:lastRow="0" w:noHBand="0" w:noVBand="1" w:val="04A0"/>
-      </w:tblPr>
-      <w:tblGrid>
-        <w:gridCol w:w="3096"/>
-        <w:gridCol w:w="6984"/>
-      </w:tblGrid>
-      <w:tr>
-        <w:trPr>
-          <w:cantSplit/>
-        </w:trPr>
-        <w:tc>
-          <w:tcPr>
-            <w:tcW w:type="dxa" w:w="5112"/>
-            <w:shd w:fill="FBF7ED"/>
-            <w:vAlign w:val="top"/>
-            <w:tcBorders>
-              <w:top w:val="single" w:sz="6" w:color="C8D5E3"/>
-              <w:start w:val="single" w:sz="6" w:color="C8D5E3"/>
-              <w:bottom w:val="single" w:sz="6" w:color="C8D5E3"/>
-              <w:end w:val="single" w:sz="6" w:color="C8D5E3"/>
-            </w:tcBorders>
-          </w:tcPr>
-          <w:p>
-            <w:pPr>
-              <w:spacing w:after="40"/>
-            </w:pPr>
-            <w:r>
-              <w:rPr>
-                <w:rFonts w:ascii="Aptos" w:hAnsi="Aptos"/>
-                <w:b/>
-                <w:color w:val="0B2348"/>
-                <w:sz w:val="20"/>
-              </w:rPr>
-              <w:t>35 · s1-score-2-c</w:t>
-            </w:r>
-          </w:p>
-          <w:p>
-            <w:pPr>
-              <w:spacing w:after="20"/>
-            </w:pPr>
-            <w:r>
-              <w:rPr>
-                <w:rFonts w:ascii="Aptos" w:hAnsi="Aptos"/>
-                <w:b/>
-                <w:color w:val="1178B5"/>
-                <w:sz w:val="18"/>
-              </w:rPr>
-              <w:t>s1-score-2-c.mp3</w:t>
-            </w:r>
-          </w:p>
-          <w:p>
-            <w:pPr>
-              <w:spacing w:after="20"/>
-            </w:pPr>
-            <w:r>
-              <w:rPr>
-                <w:rFonts w:ascii="Aptos" w:hAnsi="Aptos"/>
-                <w:color w:val="61748A"/>
-                <w:sz w:val="17"/>
-              </w:rPr>
-              <w:t>Encouraging · scoreReflection_2</w:t>
-            </w:r>
-          </w:p>
-        </w:tc>
-        <w:tc>
-          <w:tcPr>
-            <w:tcW w:type="dxa" w:w="5112"/>
-            <w:shd w:fill="FFFFFF"/>
-            <w:vAlign w:val="top"/>
-            <w:tcBorders>
-              <w:top w:val="single" w:sz="6" w:color="C8D5E3"/>
-              <w:start w:val="single" w:sz="6" w:color="C8D5E3"/>
-              <w:bottom w:val="single" w:sz="6" w:color="C8D5E3"/>
-              <w:end w:val="single" w:sz="6" w:color="C8D5E3"/>
-            </w:tcBorders>
-          </w:tcPr>
-          <w:p>
-            <w:pPr>
-              <w:spacing w:after="0"/>
-            </w:pPr>
-            <w:r>
-              <w:rPr>
-                <w:rFonts w:ascii="Aptos" w:hAnsi="Aptos"/>
-                <w:color w:val="14233B"/>
-                <w:sz w:val="23"/>
-              </w:rPr>
-              <w:t>Add the missing design information and try again. You are close to having a brief Claude can actually reason from.</w:t>
-            </w:r>
-          </w:p>
-        </w:tc>
-      </w:tr>
-    </w:tbl>
-    <w:p>
-      <w:pPr>
-        <w:spacing w:after="20"/>
-      </w:pPr>
-    </w:p>
-    <w:tbl>
-      <w:tblPr>
-        <w:tblW w:type="auto" w:w="0"/>
-        <w:jc w:val="center"/>
-        <w:tblLayout w:type="fixed"/>
-        <w:tblLook w:firstColumn="1" w:firstRow="1" w:lastColumn="0" w:lastRow="0" w:noHBand="0" w:noVBand="1" w:val="04A0"/>
-      </w:tblPr>
-      <w:tblGrid>
-        <w:gridCol w:w="3096"/>
-        <w:gridCol w:w="6984"/>
-      </w:tblGrid>
-      <w:tr>
-        <w:trPr>
-          <w:cantSplit/>
-        </w:trPr>
-        <w:tc>
-          <w:tcPr>
-            <w:tcW w:type="dxa" w:w="5112"/>
-            <w:shd w:fill="FBF7ED"/>
-            <w:vAlign w:val="top"/>
-            <w:tcBorders>
-              <w:top w:val="single" w:sz="6" w:color="C8D5E3"/>
-              <w:start w:val="single" w:sz="6" w:color="C8D5E3"/>
-              <w:bottom w:val="single" w:sz="6" w:color="C8D5E3"/>
-              <w:end w:val="single" w:sz="6" w:color="C8D5E3"/>
-            </w:tcBorders>
-          </w:tcPr>
-          <w:p>
-            <w:pPr>
-              <w:spacing w:after="40"/>
-            </w:pPr>
-            <w:r>
-              <w:rPr>
-                <w:rFonts w:ascii="Aptos" w:hAnsi="Aptos"/>
-                <w:b/>
-                <w:color w:val="0B2348"/>
-                <w:sz w:val="20"/>
-              </w:rPr>
-              <w:t>36 · s1-score-3-a</w:t>
-            </w:r>
-          </w:p>
-          <w:p>
-            <w:pPr>
-              <w:spacing w:after="20"/>
-            </w:pPr>
-            <w:r>
-              <w:rPr>
-                <w:rFonts w:ascii="Aptos" w:hAnsi="Aptos"/>
-                <w:b/>
-                <w:color w:val="1178B5"/>
-                <w:sz w:val="18"/>
-              </w:rPr>
-              <w:t>s1-score-3-a.mp3</w:t>
-            </w:r>
-          </w:p>
-          <w:p>
-            <w:pPr>
-              <w:spacing w:after="20"/>
-            </w:pPr>
-            <w:r>
-              <w:rPr>
-                <w:rFonts w:ascii="Aptos" w:hAnsi="Aptos"/>
-                <w:color w:val="61748A"/>
-                <w:sz w:val="17"/>
-              </w:rPr>
-              <w:t>Encouraging · scoreReflection_3</w:t>
-            </w:r>
-          </w:p>
-        </w:tc>
-        <w:tc>
-          <w:tcPr>
-            <w:tcW w:type="dxa" w:w="5112"/>
-            <w:shd w:fill="FFFFFF"/>
-            <w:vAlign w:val="top"/>
-            <w:tcBorders>
-              <w:top w:val="single" w:sz="6" w:color="C8D5E3"/>
-              <w:start w:val="single" w:sz="6" w:color="C8D5E3"/>
-              <w:bottom w:val="single" w:sz="6" w:color="C8D5E3"/>
-              <w:end w:val="single" w:sz="6" w:color="C8D5E3"/>
-            </w:tcBorders>
-          </w:tcPr>
-          <w:p>
-            <w:pPr>
-              <w:spacing w:after="0"/>
-            </w:pPr>
-            <w:r>
-              <w:rPr>
-                <w:rFonts w:ascii="Aptos" w:hAnsi="Aptos"/>
-                <w:color w:val="14233B"/>
-                <w:sz w:val="23"/>
-              </w:rPr>
-              <w:t>Three out of five. That is enough structure for Claude to attempt a defensible repair, but I would not call the design brief complete yet.</w:t>
-            </w:r>
-          </w:p>
-        </w:tc>
-      </w:tr>
-    </w:tbl>
-    <w:p>
-      <w:pPr>
-        <w:spacing w:after="20"/>
-      </w:pPr>
-    </w:p>
-    <w:tbl>
-      <w:tblPr>
-        <w:tblW w:type="auto" w:w="0"/>
-        <w:jc w:val="center"/>
-        <w:tblLayout w:type="fixed"/>
-        <w:tblLook w:firstColumn="1" w:firstRow="1" w:lastColumn="0" w:lastRow="0" w:noHBand="0" w:noVBand="1" w:val="04A0"/>
-      </w:tblPr>
-      <w:tblGrid>
-        <w:gridCol w:w="3096"/>
-        <w:gridCol w:w="6984"/>
-      </w:tblGrid>
-      <w:tr>
-        <w:trPr>
-          <w:cantSplit/>
-        </w:trPr>
-        <w:tc>
-          <w:tcPr>
-            <w:tcW w:type="dxa" w:w="5112"/>
-            <w:shd w:fill="FBF7ED"/>
-            <w:vAlign w:val="top"/>
-            <w:tcBorders>
-              <w:top w:val="single" w:sz="6" w:color="C8D5E3"/>
-              <w:start w:val="single" w:sz="6" w:color="C8D5E3"/>
-              <w:bottom w:val="single" w:sz="6" w:color="C8D5E3"/>
-              <w:end w:val="single" w:sz="6" w:color="C8D5E3"/>
-            </w:tcBorders>
-          </w:tcPr>
-          <w:p>
-            <w:pPr>
-              <w:spacing w:after="40"/>
-            </w:pPr>
-            <w:r>
-              <w:rPr>
-                <w:rFonts w:ascii="Aptos" w:hAnsi="Aptos"/>
-                <w:b/>
-                <w:color w:val="0B2348"/>
-                <w:sz w:val="20"/>
-              </w:rPr>
-              <w:t>37 · s1-score-3-b</w:t>
-            </w:r>
-          </w:p>
-          <w:p>
-            <w:pPr>
-              <w:spacing w:after="20"/>
-            </w:pPr>
-            <w:r>
-              <w:rPr>
-                <w:rFonts w:ascii="Aptos" w:hAnsi="Aptos"/>
-                <w:b/>
-                <w:color w:val="1178B5"/>
-                <w:sz w:val="18"/>
-              </w:rPr>
-              <w:t>s1-score-3-b.mp3</w:t>
-            </w:r>
-          </w:p>
-          <w:p>
-            <w:pPr>
-              <w:spacing w:after="20"/>
-            </w:pPr>
-            <w:r>
-              <w:rPr>
-                <w:rFonts w:ascii="Aptos" w:hAnsi="Aptos"/>
-                <w:color w:val="61748A"/>
-                <w:sz w:val="17"/>
-              </w:rPr>
-              <w:t>Thinking · scoreReflection_3</w:t>
-            </w:r>
-          </w:p>
-        </w:tc>
-        <w:tc>
-          <w:tcPr>
-            <w:tcW w:type="dxa" w:w="5112"/>
-            <w:shd w:fill="FFFFFF"/>
-            <w:vAlign w:val="top"/>
-            <w:tcBorders>
-              <w:top w:val="single" w:sz="6" w:color="C8D5E3"/>
-              <w:start w:val="single" w:sz="6" w:color="C8D5E3"/>
-              <w:bottom w:val="single" w:sz="6" w:color="C8D5E3"/>
-              <w:end w:val="single" w:sz="6" w:color="C8D5E3"/>
-            </w:tcBorders>
-          </w:tcPr>
-          <w:p>
-            <w:pPr>
-              <w:spacing w:after="0"/>
-            </w:pPr>
-            <w:r>
-              <w:rPr>
-                <w:rFonts w:ascii="Aptos" w:hAnsi="Aptos"/>
-                <w:color w:val="14233B"/>
-                <w:sz w:val="23"/>
-              </w:rPr>
-              <w:t>The draft may work, but some of its quality still depends on Claude making assumptions for you. A stronger prompt reduces those assumptions and makes your instructional intent easier to verify.</w:t>
-            </w:r>
-          </w:p>
-        </w:tc>
-      </w:tr>
-    </w:tbl>
-    <w:p>
-      <w:pPr>
-        <w:spacing w:after="20"/>
-      </w:pPr>
-    </w:p>
-    <w:tbl>
-      <w:tblPr>
-        <w:tblW w:type="auto" w:w="0"/>
-        <w:jc w:val="center"/>
-        <w:tblLayout w:type="fixed"/>
-        <w:tblLook w:firstColumn="1" w:firstRow="1" w:lastColumn="0" w:lastRow="0" w:noHBand="0" w:noVBand="1" w:val="04A0"/>
-      </w:tblPr>
-      <w:tblGrid>
-        <w:gridCol w:w="3096"/>
-        <w:gridCol w:w="6984"/>
-      </w:tblGrid>
-      <w:tr>
-        <w:trPr>
-          <w:cantSplit/>
-        </w:trPr>
-        <w:tc>
-          <w:tcPr>
-            <w:tcW w:type="dxa" w:w="5112"/>
-            <w:shd w:fill="FBF7ED"/>
-            <w:vAlign w:val="top"/>
-            <w:tcBorders>
-              <w:top w:val="single" w:sz="6" w:color="C8D5E3"/>
-              <w:start w:val="single" w:sz="6" w:color="C8D5E3"/>
-              <w:bottom w:val="single" w:sz="6" w:color="C8D5E3"/>
-              <w:end w:val="single" w:sz="6" w:color="C8D5E3"/>
-            </w:tcBorders>
-          </w:tcPr>
-          <w:p>
-            <w:pPr>
-              <w:spacing w:after="40"/>
-            </w:pPr>
-            <w:r>
-              <w:rPr>
-                <w:rFonts w:ascii="Aptos" w:hAnsi="Aptos"/>
-                <w:b/>
-                <w:color w:val="0B2348"/>
-                <w:sz w:val="20"/>
-              </w:rPr>
-              <w:t>38 · s1-score-3-c</w:t>
-            </w:r>
-          </w:p>
-          <w:p>
-            <w:pPr>
-              <w:spacing w:after="20"/>
-            </w:pPr>
-            <w:r>
-              <w:rPr>
-                <w:rFonts w:ascii="Aptos" w:hAnsi="Aptos"/>
-                <w:b/>
-                <w:color w:val="1178B5"/>
-                <w:sz w:val="18"/>
-              </w:rPr>
-              <w:t>s1-score-3-c.mp3</w:t>
-            </w:r>
-          </w:p>
-          <w:p>
-            <w:pPr>
-              <w:spacing w:after="20"/>
-            </w:pPr>
-            <w:r>
-              <w:rPr>
-                <w:rFonts w:ascii="Aptos" w:hAnsi="Aptos"/>
-                <w:color w:val="61748A"/>
-                <w:sz w:val="17"/>
-              </w:rPr>
-              <w:t>Encouraging · scoreReflection_3</w:t>
-            </w:r>
-          </w:p>
-        </w:tc>
-        <w:tc>
-          <w:tcPr>
-            <w:tcW w:type="dxa" w:w="5112"/>
-            <w:shd w:fill="FFFFFF"/>
-            <w:vAlign w:val="top"/>
-            <w:tcBorders>
-              <w:top w:val="single" w:sz="6" w:color="C8D5E3"/>
-              <w:start w:val="single" w:sz="6" w:color="C8D5E3"/>
-              <w:bottom w:val="single" w:sz="6" w:color="C8D5E3"/>
-              <w:end w:val="single" w:sz="6" w:color="C8D5E3"/>
-            </w:tcBorders>
-          </w:tcPr>
-          <w:p>
-            <w:pPr>
-              <w:spacing w:after="0"/>
-            </w:pPr>
-            <w:r>
-              <w:rPr>
-                <w:rFonts w:ascii="Aptos" w:hAnsi="Aptos"/>
-                <w:color w:val="14233B"/>
-                <w:sz w:val="23"/>
-              </w:rPr>
-              <w:t>You can move forward, or revise once more and see whether a more complete brief produces a more precise repair.</w:t>
-            </w:r>
-          </w:p>
-        </w:tc>
-      </w:tr>
-    </w:tbl>
-    <w:p>
-      <w:pPr>
-        <w:spacing w:after="20"/>
-      </w:pPr>
-    </w:p>
-    <w:tbl>
-      <w:tblPr>
-        <w:tblW w:type="auto" w:w="0"/>
-        <w:jc w:val="center"/>
-        <w:tblLayout w:type="fixed"/>
-        <w:tblLook w:firstColumn="1" w:firstRow="1" w:lastColumn="0" w:lastRow="0" w:noHBand="0" w:noVBand="1" w:val="04A0"/>
-      </w:tblPr>
-      <w:tblGrid>
-        <w:gridCol w:w="3096"/>
-        <w:gridCol w:w="6984"/>
-      </w:tblGrid>
-      <w:tr>
-        <w:trPr>
-          <w:cantSplit/>
-        </w:trPr>
-        <w:tc>
-          <w:tcPr>
-            <w:tcW w:type="dxa" w:w="5112"/>
-            <w:shd w:fill="FBF7ED"/>
-            <w:vAlign w:val="top"/>
-            <w:tcBorders>
-              <w:top w:val="single" w:sz="6" w:color="C8D5E3"/>
-              <w:start w:val="single" w:sz="6" w:color="C8D5E3"/>
-              <w:bottom w:val="single" w:sz="6" w:color="C8D5E3"/>
-              <w:end w:val="single" w:sz="6" w:color="C8D5E3"/>
-            </w:tcBorders>
-          </w:tcPr>
-          <w:p>
-            <w:pPr>
-              <w:spacing w:after="40"/>
-            </w:pPr>
-            <w:r>
-              <w:rPr>
-                <w:rFonts w:ascii="Aptos" w:hAnsi="Aptos"/>
-                <w:b/>
-                <w:color w:val="0B2348"/>
-                <w:sz w:val="20"/>
-              </w:rPr>
-              <w:t>39 · s1-score-4-a</w:t>
-            </w:r>
-          </w:p>
-          <w:p>
-            <w:pPr>
-              <w:spacing w:after="20"/>
-            </w:pPr>
-            <w:r>
-              <w:rPr>
-                <w:rFonts w:ascii="Aptos" w:hAnsi="Aptos"/>
-                <w:b/>
-                <w:color w:val="1178B5"/>
-                <w:sz w:val="18"/>
-              </w:rPr>
-              <w:t>s1-score-4-a.mp3</w:t>
-            </w:r>
-          </w:p>
-          <w:p>
-            <w:pPr>
-              <w:spacing w:after="20"/>
-            </w:pPr>
-            <w:r>
-              <w:rPr>
-                <w:rFonts w:ascii="Aptos" w:hAnsi="Aptos"/>
-                <w:color w:val="61748A"/>
-                <w:sz w:val="17"/>
-              </w:rPr>
-              <w:t>Proud · scoreReflection_4</w:t>
-            </w:r>
-          </w:p>
-        </w:tc>
-        <w:tc>
-          <w:tcPr>
-            <w:tcW w:type="dxa" w:w="5112"/>
-            <w:shd w:fill="FFFFFF"/>
-            <w:vAlign w:val="top"/>
-            <w:tcBorders>
-              <w:top w:val="single" w:sz="6" w:color="C8D5E3"/>
-              <w:start w:val="single" w:sz="6" w:color="C8D5E3"/>
-              <w:bottom w:val="single" w:sz="6" w:color="C8D5E3"/>
-              <w:end w:val="single" w:sz="6" w:color="C8D5E3"/>
-            </w:tcBorders>
-          </w:tcPr>
-          <w:p>
-            <w:pPr>
-              <w:spacing w:after="0"/>
-            </w:pPr>
-            <w:r>
-              <w:rPr>
-                <w:rFonts w:ascii="Aptos" w:hAnsi="Aptos"/>
-                <w:color w:val="14233B"/>
-                <w:sz w:val="23"/>
-              </w:rPr>
-              <w:t>Four out of five. This is a strong design brief. Claude had enough context to make a targeted repair instead of simply rewriting the discussion prompt.</w:t>
-            </w:r>
-          </w:p>
-        </w:tc>
-      </w:tr>
-    </w:tbl>
-    <w:p>
-      <w:pPr>
-        <w:spacing w:after="20"/>
-      </w:pPr>
-    </w:p>
-    <w:tbl>
-      <w:tblPr>
-        <w:tblW w:type="auto" w:w="0"/>
-        <w:jc w:val="center"/>
-        <w:tblLayout w:type="fixed"/>
-        <w:tblLook w:firstColumn="1" w:firstRow="1" w:lastColumn="0" w:lastRow="0" w:noHBand="0" w:noVBand="1" w:val="04A0"/>
-      </w:tblPr>
-      <w:tblGrid>
-        <w:gridCol w:w="3096"/>
-        <w:gridCol w:w="6984"/>
-      </w:tblGrid>
-      <w:tr>
-        <w:trPr>
-          <w:cantSplit/>
-        </w:trPr>
-        <w:tc>
-          <w:tcPr>
-            <w:tcW w:type="dxa" w:w="5112"/>
-            <w:shd w:fill="FBF7ED"/>
-            <w:vAlign w:val="top"/>
-            <w:tcBorders>
-              <w:top w:val="single" w:sz="6" w:color="C8D5E3"/>
-              <w:start w:val="single" w:sz="6" w:color="C8D5E3"/>
-              <w:bottom w:val="single" w:sz="6" w:color="C8D5E3"/>
-              <w:end w:val="single" w:sz="6" w:color="C8D5E3"/>
-            </w:tcBorders>
-          </w:tcPr>
-          <w:p>
-            <w:pPr>
-              <w:spacing w:after="40"/>
-            </w:pPr>
-            <w:r>
-              <w:rPr>
-                <w:rFonts w:ascii="Aptos" w:hAnsi="Aptos"/>
-                <w:b/>
-                <w:color w:val="0B2348"/>
-                <w:sz w:val="20"/>
-              </w:rPr>
-              <w:t>40 · s1-score-4-b</w:t>
-            </w:r>
-          </w:p>
-          <w:p>
-            <w:pPr>
-              <w:spacing w:after="20"/>
-            </w:pPr>
-            <w:r>
-              <w:rPr>
-                <w:rFonts w:ascii="Aptos" w:hAnsi="Aptos"/>
-                <w:b/>
-                <w:color w:val="1178B5"/>
-                <w:sz w:val="18"/>
-              </w:rPr>
-              <w:t>s1-score-4-b.mp3</w:t>
-            </w:r>
-          </w:p>
-          <w:p>
-            <w:pPr>
-              <w:spacing w:after="20"/>
-            </w:pPr>
-            <w:r>
-              <w:rPr>
-                <w:rFonts w:ascii="Aptos" w:hAnsi="Aptos"/>
-                <w:color w:val="61748A"/>
-                <w:sz w:val="17"/>
-              </w:rPr>
-              <w:t>Thinking · scoreReflection_4</w:t>
-            </w:r>
-          </w:p>
-        </w:tc>
-        <w:tc>
-          <w:tcPr>
-            <w:tcW w:type="dxa" w:w="5112"/>
-            <w:shd w:fill="FFFFFF"/>
-            <w:vAlign w:val="top"/>
-            <w:tcBorders>
-              <w:top w:val="single" w:sz="6" w:color="C8D5E3"/>
-              <w:start w:val="single" w:sz="6" w:color="C8D5E3"/>
-              <w:bottom w:val="single" w:sz="6" w:color="C8D5E3"/>
-              <w:end w:val="single" w:sz="6" w:color="C8D5E3"/>
-            </w:tcBorders>
-          </w:tcPr>
-          <w:p>
-            <w:pPr>
-              <w:spacing w:after="0"/>
-            </w:pPr>
-            <w:r>
-              <w:rPr>
-                <w:rFonts w:ascii="Aptos" w:hAnsi="Aptos"/>
-                <w:color w:val="14233B"/>
-                <w:sz w:val="23"/>
-              </w:rPr>
-              <w:t>There is still one area that could be clearer, which matters because small gaps are where AI starts making quiet assumptions on your behalf.</w:t>
-            </w:r>
-          </w:p>
-        </w:tc>
-      </w:tr>
-    </w:tbl>
-    <w:p>
-      <w:pPr>
-        <w:spacing w:after="20"/>
-      </w:pPr>
-    </w:p>
-    <w:tbl>
-      <w:tblPr>
-        <w:tblW w:type="auto" w:w="0"/>
-        <w:jc w:val="center"/>
-        <w:tblLayout w:type="fixed"/>
-        <w:tblLook w:firstColumn="1" w:firstRow="1" w:lastColumn="0" w:lastRow="0" w:noHBand="0" w:noVBand="1" w:val="04A0"/>
-      </w:tblPr>
-      <w:tblGrid>
-        <w:gridCol w:w="3096"/>
-        <w:gridCol w:w="6984"/>
-      </w:tblGrid>
-      <w:tr>
-        <w:trPr>
-          <w:cantSplit/>
-        </w:trPr>
-        <w:tc>
-          <w:tcPr>
-            <w:tcW w:type="dxa" w:w="5112"/>
-            <w:shd w:fill="FBF7ED"/>
-            <w:vAlign w:val="top"/>
-            <w:tcBorders>
-              <w:top w:val="single" w:sz="6" w:color="C8D5E3"/>
-              <w:start w:val="single" w:sz="6" w:color="C8D5E3"/>
-              <w:bottom w:val="single" w:sz="6" w:color="C8D5E3"/>
-              <w:end w:val="single" w:sz="6" w:color="C8D5E3"/>
-            </w:tcBorders>
-          </w:tcPr>
-          <w:p>
-            <w:pPr>
-              <w:spacing w:after="40"/>
-            </w:pPr>
-            <w:r>
-              <w:rPr>
-                <w:rFonts w:ascii="Aptos" w:hAnsi="Aptos"/>
-                <w:b/>
-                <w:color w:val="0B2348"/>
-                <w:sz w:val="20"/>
-              </w:rPr>
-              <w:t>41 · s1-score-4-c</w:t>
-            </w:r>
-          </w:p>
-          <w:p>
-            <w:pPr>
-              <w:spacing w:after="20"/>
-            </w:pPr>
-            <w:r>
-              <w:rPr>
-                <w:rFonts w:ascii="Aptos" w:hAnsi="Aptos"/>
-                <w:b/>
-                <w:color w:val="1178B5"/>
-                <w:sz w:val="18"/>
-              </w:rPr>
-              <w:t>s1-score-4-c.mp3</w:t>
-            </w:r>
-          </w:p>
-          <w:p>
-            <w:pPr>
-              <w:spacing w:after="20"/>
-            </w:pPr>
-            <w:r>
-              <w:rPr>
-                <w:rFonts w:ascii="Aptos" w:hAnsi="Aptos"/>
-                <w:color w:val="61748A"/>
-                <w:sz w:val="17"/>
-              </w:rPr>
-              <w:t>Proud · scoreReflection_4</w:t>
-            </w:r>
-          </w:p>
-        </w:tc>
-        <w:tc>
-          <w:tcPr>
-            <w:tcW w:type="dxa" w:w="5112"/>
-            <w:shd w:fill="FFFFFF"/>
-            <w:vAlign w:val="top"/>
-            <w:tcBorders>
-              <w:top w:val="single" w:sz="6" w:color="C8D5E3"/>
-              <w:start w:val="single" w:sz="6" w:color="C8D5E3"/>
-              <w:bottom w:val="single" w:sz="6" w:color="C8D5E3"/>
-              <w:end w:val="single" w:sz="6" w:color="C8D5E3"/>
-            </w:tcBorders>
-          </w:tcPr>
-          <w:p>
-            <w:pPr>
-              <w:spacing w:after="0"/>
-            </w:pPr>
-            <w:r>
-              <w:rPr>
-                <w:rFonts w:ascii="Aptos" w:hAnsi="Aptos"/>
-                <w:color w:val="14233B"/>
-                <w:sz w:val="23"/>
-              </w:rPr>
-              <w:t>The important shift is here: you gave the replies an instructional purpose, not just a participation requirement. That is a meaningful redesign.</w:t>
-            </w:r>
-          </w:p>
-        </w:tc>
-      </w:tr>
-    </w:tbl>
-    <w:p>
-      <w:pPr>
-        <w:spacing w:after="20"/>
-      </w:pPr>
-    </w:p>
-    <w:tbl>
-      <w:tblPr>
-        <w:tblW w:type="auto" w:w="0"/>
-        <w:jc w:val="center"/>
-        <w:tblLayout w:type="fixed"/>
-        <w:tblLook w:firstColumn="1" w:firstRow="1" w:lastColumn="0" w:lastRow="0" w:noHBand="0" w:noVBand="1" w:val="04A0"/>
-      </w:tblPr>
-      <w:tblGrid>
-        <w:gridCol w:w="3096"/>
-        <w:gridCol w:w="6984"/>
-      </w:tblGrid>
-      <w:tr>
-        <w:trPr>
-          <w:cantSplit/>
-        </w:trPr>
-        <w:tc>
-          <w:tcPr>
-            <w:tcW w:type="dxa" w:w="5112"/>
-            <w:shd w:fill="FBF7ED"/>
-            <w:vAlign w:val="top"/>
-            <w:tcBorders>
-              <w:top w:val="single" w:sz="6" w:color="C8D5E3"/>
-              <w:start w:val="single" w:sz="6" w:color="C8D5E3"/>
-              <w:bottom w:val="single" w:sz="6" w:color="C8D5E3"/>
-              <w:end w:val="single" w:sz="6" w:color="C8D5E3"/>
-            </w:tcBorders>
-          </w:tcPr>
-          <w:p>
-            <w:pPr>
-              <w:spacing w:after="40"/>
-            </w:pPr>
-            <w:r>
-              <w:rPr>
-                <w:rFonts w:ascii="Aptos" w:hAnsi="Aptos"/>
-                <w:b/>
-                <w:color w:val="0B2348"/>
-                <w:sz w:val="20"/>
-              </w:rPr>
-              <w:t>42 · s1-score-5-a</w:t>
-            </w:r>
-          </w:p>
-          <w:p>
-            <w:pPr>
-              <w:spacing w:after="20"/>
-            </w:pPr>
-            <w:r>
-              <w:rPr>
-                <w:rFonts w:ascii="Aptos" w:hAnsi="Aptos"/>
-                <w:b/>
-                <w:color w:val="1178B5"/>
-                <w:sz w:val="18"/>
-              </w:rPr>
-              <w:t>s1-score-5-a.mp3</w:t>
-            </w:r>
-          </w:p>
-          <w:p>
-            <w:pPr>
-              <w:spacing w:after="20"/>
-            </w:pPr>
-            <w:r>
-              <w:rPr>
-                <w:rFonts w:ascii="Aptos" w:hAnsi="Aptos"/>
-                <w:color w:val="61748A"/>
-                <w:sz w:val="17"/>
-              </w:rPr>
-              <w:t>Proud · scoreReflection_5</w:t>
-            </w:r>
-          </w:p>
-        </w:tc>
-        <w:tc>
-          <w:tcPr>
-            <w:tcW w:type="dxa" w:w="5112"/>
-            <w:shd w:fill="FFFFFF"/>
-            <w:vAlign w:val="top"/>
-            <w:tcBorders>
-              <w:top w:val="single" w:sz="6" w:color="C8D5E3"/>
-              <w:start w:val="single" w:sz="6" w:color="C8D5E3"/>
-              <w:bottom w:val="single" w:sz="6" w:color="C8D5E3"/>
-              <w:end w:val="single" w:sz="6" w:color="C8D5E3"/>
-            </w:tcBorders>
-          </w:tcPr>
-          <w:p>
-            <w:pPr>
-              <w:spacing w:after="0"/>
-            </w:pPr>
-            <w:r>
-              <w:rPr>
-                <w:rFonts w:ascii="Aptos" w:hAnsi="Aptos"/>
-                <w:color w:val="14233B"/>
-                <w:sz w:val="23"/>
-              </w:rPr>
-              <w:t>Five out of five. You gave Claude a complete design brief: learner context, the actual problem, the interaction you want, the constraints, and a clear success signal.</w:t>
-            </w:r>
-          </w:p>
-        </w:tc>
-      </w:tr>
-    </w:tbl>
-    <w:p>
-      <w:pPr>
-        <w:spacing w:after="20"/>
-      </w:pPr>
-    </w:p>
-    <w:tbl>
-      <w:tblPr>
-        <w:tblW w:type="auto" w:w="0"/>
-        <w:jc w:val="center"/>
-        <w:tblLayout w:type="fixed"/>
-        <w:tblLook w:firstColumn="1" w:firstRow="1" w:lastColumn="0" w:lastRow="0" w:noHBand="0" w:noVBand="1" w:val="04A0"/>
-      </w:tblPr>
-      <w:tblGrid>
-        <w:gridCol w:w="3096"/>
-        <w:gridCol w:w="6984"/>
-      </w:tblGrid>
-      <w:tr>
-        <w:trPr>
-          <w:cantSplit/>
-        </w:trPr>
-        <w:tc>
-          <w:tcPr>
-            <w:tcW w:type="dxa" w:w="5112"/>
-            <w:shd w:fill="FBF7ED"/>
-            <w:vAlign w:val="top"/>
-            <w:tcBorders>
-              <w:top w:val="single" w:sz="6" w:color="C8D5E3"/>
-              <w:start w:val="single" w:sz="6" w:color="C8D5E3"/>
-              <w:bottom w:val="single" w:sz="6" w:color="C8D5E3"/>
-              <w:end w:val="single" w:sz="6" w:color="C8D5E3"/>
-            </w:tcBorders>
-          </w:tcPr>
-          <w:p>
-            <w:pPr>
-              <w:spacing w:after="40"/>
-            </w:pPr>
-            <w:r>
-              <w:rPr>
-                <w:rFonts w:ascii="Aptos" w:hAnsi="Aptos"/>
-                <w:b/>
-                <w:color w:val="0B2348"/>
-                <w:sz w:val="20"/>
-              </w:rPr>
-              <w:t>43 · s1-score-5-b</w:t>
-            </w:r>
-          </w:p>
-          <w:p>
-            <w:pPr>
-              <w:spacing w:after="20"/>
-            </w:pPr>
-            <w:r>
-              <w:rPr>
-                <w:rFonts w:ascii="Aptos" w:hAnsi="Aptos"/>
-                <w:b/>
-                <w:color w:val="1178B5"/>
-                <w:sz w:val="18"/>
-              </w:rPr>
-              <w:t>s1-score-5-b.mp3</w:t>
-            </w:r>
-          </w:p>
-          <w:p>
-            <w:pPr>
-              <w:spacing w:after="20"/>
-            </w:pPr>
-            <w:r>
-              <w:rPr>
-                <w:rFonts w:ascii="Aptos" w:hAnsi="Aptos"/>
-                <w:color w:val="61748A"/>
-                <w:sz w:val="17"/>
-              </w:rPr>
-              <w:t>Thinking · scoreReflection_5</w:t>
-            </w:r>
-          </w:p>
-        </w:tc>
-        <w:tc>
-          <w:tcPr>
-            <w:tcW w:type="dxa" w:w="5112"/>
-            <w:shd w:fill="FFFFFF"/>
-            <w:vAlign w:val="top"/>
-            <w:tcBorders>
-              <w:top w:val="single" w:sz="6" w:color="C8D5E3"/>
-              <w:start w:val="single" w:sz="6" w:color="C8D5E3"/>
-              <w:bottom w:val="single" w:sz="6" w:color="C8D5E3"/>
-              <w:end w:val="single" w:sz="6" w:color="C8D5E3"/>
-            </w:tcBorders>
-          </w:tcPr>
-          <w:p>
-            <w:pPr>
-              <w:spacing w:after="0"/>
-            </w:pPr>
-            <w:r>
-              <w:rPr>
-                <w:rFonts w:ascii="Aptos" w:hAnsi="Aptos"/>
-                <w:color w:val="14233B"/>
-                <w:sz w:val="23"/>
-              </w:rPr>
-              <w:t>That does not mean Claude is automatically right. It means you gave it enough information that you can judge whether its repair actually follows your instructional intent.</w:t>
-            </w:r>
-          </w:p>
-        </w:tc>
-      </w:tr>
-    </w:tbl>
-    <w:p>
-      <w:pPr>
-        <w:spacing w:after="20"/>
-      </w:pPr>
-    </w:p>
-    <w:tbl>
-      <w:tblPr>
-        <w:tblW w:type="auto" w:w="0"/>
-        <w:jc w:val="center"/>
-        <w:tblLayout w:type="fixed"/>
-        <w:tblLook w:firstColumn="1" w:firstRow="1" w:lastColumn="0" w:lastRow="0" w:noHBand="0" w:noVBand="1" w:val="04A0"/>
-      </w:tblPr>
-      <w:tblGrid>
-        <w:gridCol w:w="3096"/>
-        <w:gridCol w:w="6984"/>
-      </w:tblGrid>
-      <w:tr>
-        <w:trPr>
-          <w:cantSplit/>
-        </w:trPr>
-        <w:tc>
-          <w:tcPr>
-            <w:tcW w:type="dxa" w:w="5112"/>
-            <w:shd w:fill="FBF7ED"/>
-            <w:vAlign w:val="top"/>
-            <w:tcBorders>
-              <w:top w:val="single" w:sz="6" w:color="C8D5E3"/>
-              <w:start w:val="single" w:sz="6" w:color="C8D5E3"/>
-              <w:bottom w:val="single" w:sz="6" w:color="C8D5E3"/>
-              <w:end w:val="single" w:sz="6" w:color="C8D5E3"/>
-            </w:tcBorders>
-          </w:tcPr>
-          <w:p>
-            <w:pPr>
-              <w:spacing w:after="40"/>
-            </w:pPr>
-            <w:r>
-              <w:rPr>
-                <w:rFonts w:ascii="Aptos" w:hAnsi="Aptos"/>
-                <w:b/>
-                <w:color w:val="0B2348"/>
-                <w:sz w:val="20"/>
-              </w:rPr>
-              <w:t>44 · s1-score-5-c</w:t>
-            </w:r>
-          </w:p>
-          <w:p>
-            <w:pPr>
-              <w:spacing w:after="20"/>
-            </w:pPr>
-            <w:r>
-              <w:rPr>
-                <w:rFonts w:ascii="Aptos" w:hAnsi="Aptos"/>
-                <w:b/>
-                <w:color w:val="1178B5"/>
-                <w:sz w:val="18"/>
-              </w:rPr>
-              <w:t>s1-score-5-c.mp3</w:t>
-            </w:r>
-          </w:p>
-          <w:p>
-            <w:pPr>
-              <w:spacing w:after="20"/>
-            </w:pPr>
-            <w:r>
-              <w:rPr>
-                <w:rFonts w:ascii="Aptos" w:hAnsi="Aptos"/>
-                <w:color w:val="61748A"/>
-                <w:sz w:val="17"/>
-              </w:rPr>
-              <w:t>Proud · scoreReflection_5</w:t>
-            </w:r>
-          </w:p>
-        </w:tc>
-        <w:tc>
-          <w:tcPr>
-            <w:tcW w:type="dxa" w:w="5112"/>
-            <w:shd w:fill="FFFFFF"/>
-            <w:vAlign w:val="top"/>
-            <w:tcBorders>
-              <w:top w:val="single" w:sz="6" w:color="C8D5E3"/>
-              <w:start w:val="single" w:sz="6" w:color="C8D5E3"/>
-              <w:bottom w:val="single" w:sz="6" w:color="C8D5E3"/>
-              <w:end w:val="single" w:sz="6" w:color="C8D5E3"/>
-            </w:tcBorders>
-          </w:tcPr>
-          <w:p>
-            <w:pPr>
-              <w:spacing w:after="0"/>
-            </w:pPr>
-            <w:r>
-              <w:rPr>
-                <w:rFonts w:ascii="Aptos" w:hAnsi="Aptos"/>
-                <w:color w:val="14233B"/>
-                <w:sz w:val="23"/>
-              </w:rPr>
-              <w:t>That is the habit I want you to carry forward: make the reasoning visible first, then use AI to help execute the design.</w:t>
+              <w:t>That is the PromptCraft principle: use AI to move the work forward, then use human judgment to make the work trustworthy.</w:t>
             </w:r>
           </w:p>
         </w:tc>
@@ -4766,7 +4490,7 @@
                 <w:color w:val="0B2348"/>
                 <w:sz w:val="20"/>
               </w:rPr>
-              <w:t>45 · p86</w:t>
+              <w:t>37 · p86</w:t>
             </w:r>
           </w:p>
           <w:p>
@@ -4882,7 +4606,7 @@
                 <w:color w:val="0B2348"/>
                 <w:sz w:val="20"/>
               </w:rPr>
-              <w:t>46 · p88</w:t>
+              <w:t>38 · p88</w:t>
             </w:r>
           </w:p>
           <w:p>
@@ -4998,7 +4722,7 @@
                 <w:color w:val="0B2348"/>
                 <w:sz w:val="20"/>
               </w:rPr>
-              <w:t>47 · p89</w:t>
+              <w:t>39 · p89</w:t>
             </w:r>
           </w:p>
           <w:p>
@@ -5114,7 +4838,7 @@
                 <w:color w:val="0B2348"/>
                 <w:sz w:val="20"/>
               </w:rPr>
-              <w:t>48 · p90</w:t>
+              <w:t>40 · p90</w:t>
             </w:r>
           </w:p>
           <w:p>
@@ -5230,7 +4954,7 @@
                 <w:color w:val="0B2348"/>
                 <w:sz w:val="20"/>
               </w:rPr>
-              <w:t>49 · p91</w:t>
+              <w:t>41 · p91</w:t>
             </w:r>
           </w:p>
           <w:p>
@@ -5346,7 +5070,7 @@
                 <w:color w:val="0B2348"/>
                 <w:sz w:val="20"/>
               </w:rPr>
-              <w:t>50 · p92</w:t>
+              <w:t>42 · p92</w:t>
             </w:r>
           </w:p>
           <w:p>
@@ -5462,7 +5186,7 @@
                 <w:color w:val="0B2348"/>
                 <w:sz w:val="20"/>
               </w:rPr>
-              <w:t>51 · p93</w:t>
+              <w:t>43 · p93</w:t>
             </w:r>
           </w:p>
           <w:p>

</xml_diff>